<commit_message>
Cart Management integration complete
</commit_message>
<xml_diff>
--- a/Model.docx
+++ b/Model.docx
@@ -236,21 +236,12 @@
                 <w:szCs w:val="18"/>
               </w:rPr>
             </w:pPr>
-            <w:proofErr w:type="gramStart"/>
-            <w:r>
-              <w:rPr>
-                <w:sz w:val="18"/>
-                <w:szCs w:val="18"/>
-              </w:rPr>
-              <w:t>id(</w:t>
-            </w:r>
-            <w:proofErr w:type="gramEnd"/>
-            <w:r>
-              <w:rPr>
-                <w:sz w:val="18"/>
-                <w:szCs w:val="18"/>
-              </w:rPr>
-              <w:t xml:space="preserve">PK), </w:t>
+            <w:r>
+              <w:rPr>
+                <w:sz w:val="18"/>
+                <w:szCs w:val="18"/>
+              </w:rPr>
+              <w:t xml:space="preserve">id(PK), </w:t>
             </w:r>
             <w:proofErr w:type="spellStart"/>
             <w:r>
@@ -304,6 +295,86 @@
                 <w:szCs w:val="18"/>
               </w:rPr>
               <w:t>, coins</w:t>
+            </w:r>
+          </w:p>
+        </w:tc>
+      </w:tr>
+      <w:tr>
+        <w:trPr>
+          <w:trHeight w:val="314"/>
+        </w:trPr>
+        <w:tc>
+          <w:tcPr>
+            <w:tcW w:w="2635" w:type="dxa"/>
+            <w:shd w:val="clear" w:color="auto" w:fill="92D050"/>
+            <w:vAlign w:val="center"/>
+          </w:tcPr>
+          <w:p>
+            <w:pPr>
+              <w:rPr>
+                <w:sz w:val="18"/>
+                <w:szCs w:val="18"/>
+              </w:rPr>
+            </w:pPr>
+            <w:r>
+              <w:rPr>
+                <w:sz w:val="18"/>
+                <w:szCs w:val="18"/>
+              </w:rPr>
+              <w:t>Blog</w:t>
+            </w:r>
+          </w:p>
+        </w:tc>
+        <w:tc>
+          <w:tcPr>
+            <w:tcW w:w="7525" w:type="dxa"/>
+            <w:vAlign w:val="center"/>
+          </w:tcPr>
+          <w:p>
+            <w:pPr>
+              <w:rPr>
+                <w:sz w:val="18"/>
+                <w:szCs w:val="18"/>
+              </w:rPr>
+            </w:pPr>
+            <w:r>
+              <w:rPr>
+                <w:sz w:val="18"/>
+                <w:szCs w:val="18"/>
+              </w:rPr>
+              <w:t xml:space="preserve">Id(PK), </w:t>
+            </w:r>
+            <w:proofErr w:type="spellStart"/>
+            <w:r>
+              <w:rPr>
+                <w:sz w:val="18"/>
+                <w:szCs w:val="18"/>
+              </w:rPr>
+              <w:t>user_id</w:t>
+            </w:r>
+            <w:proofErr w:type="spellEnd"/>
+            <w:r>
+              <w:rPr>
+                <w:sz w:val="18"/>
+                <w:szCs w:val="18"/>
+              </w:rPr>
+              <w:t xml:space="preserve">(FK), </w:t>
+            </w:r>
+            <w:proofErr w:type="spellStart"/>
+            <w:r>
+              <w:rPr>
+                <w:sz w:val="18"/>
+                <w:szCs w:val="18"/>
+              </w:rPr>
+              <w:t>product_id</w:t>
+            </w:r>
+            <w:proofErr w:type="spellEnd"/>
+            <w:r>
+              <w:rPr>
+                <w:sz w:val="18"/>
+                <w:szCs w:val="18"/>
+              </w:rPr>
+              <w:t>(FK), subject, content, image,</w:t>
             </w:r>
           </w:p>
         </w:tc>
@@ -329,7 +400,7 @@
                 <w:sz w:val="18"/>
                 <w:szCs w:val="18"/>
               </w:rPr>
-              <w:t>Feedback</w:t>
+              <w:t>carts</w:t>
             </w:r>
           </w:p>
         </w:tc>
@@ -345,107 +416,84 @@
                 <w:szCs w:val="18"/>
               </w:rPr>
             </w:pPr>
-            <w:proofErr w:type="gramStart"/>
-            <w:r>
-              <w:rPr>
-                <w:sz w:val="18"/>
-                <w:szCs w:val="18"/>
-              </w:rPr>
-              <w:t>id(</w:t>
-            </w:r>
-            <w:proofErr w:type="gramEnd"/>
-            <w:r>
-              <w:rPr>
-                <w:sz w:val="18"/>
-                <w:szCs w:val="18"/>
-              </w:rPr>
-              <w:t xml:space="preserve">PK), </w:t>
-            </w:r>
-            <w:proofErr w:type="spellStart"/>
-            <w:r>
-              <w:rPr>
-                <w:sz w:val="18"/>
-                <w:szCs w:val="18"/>
-              </w:rPr>
-              <w:t>feedback_id</w:t>
-            </w:r>
-            <w:proofErr w:type="spellEnd"/>
-            <w:r>
-              <w:rPr>
-                <w:sz w:val="18"/>
-                <w:szCs w:val="18"/>
-              </w:rPr>
-              <w:t xml:space="preserve">, </w:t>
-            </w:r>
-            <w:proofErr w:type="spellStart"/>
-            <w:r>
-              <w:rPr>
-                <w:sz w:val="18"/>
-                <w:szCs w:val="18"/>
-              </w:rPr>
-              <w:t>user_id</w:t>
-            </w:r>
-            <w:proofErr w:type="spellEnd"/>
-            <w:r>
-              <w:rPr>
-                <w:sz w:val="18"/>
-                <w:szCs w:val="18"/>
-              </w:rPr>
-              <w:t xml:space="preserve"> (FK), </w:t>
-            </w:r>
-            <w:proofErr w:type="spellStart"/>
-            <w:r>
-              <w:rPr>
-                <w:sz w:val="18"/>
-                <w:szCs w:val="18"/>
-              </w:rPr>
-              <w:t>product</w:t>
-            </w:r>
-            <w:r>
-              <w:rPr>
-                <w:sz w:val="18"/>
-                <w:szCs w:val="18"/>
-              </w:rPr>
-              <w:t>_id</w:t>
-            </w:r>
-            <w:proofErr w:type="spellEnd"/>
-            <w:r>
-              <w:rPr>
-                <w:sz w:val="18"/>
-                <w:szCs w:val="18"/>
-              </w:rPr>
-              <w:t xml:space="preserve"> (FK), rating (1–5), </w:t>
-            </w:r>
-            <w:proofErr w:type="spellStart"/>
-            <w:r>
-              <w:rPr>
-                <w:sz w:val="18"/>
-                <w:szCs w:val="18"/>
-              </w:rPr>
-              <w:t>message,</w:t>
-            </w:r>
-            <w:r>
-              <w:rPr>
-                <w:sz w:val="18"/>
-                <w:szCs w:val="18"/>
-              </w:rPr>
-              <w:t>image</w:t>
-            </w:r>
-            <w:proofErr w:type="spellEnd"/>
-            <w:r>
-              <w:rPr>
-                <w:sz w:val="18"/>
-                <w:szCs w:val="18"/>
-              </w:rPr>
-              <w:t>,</w:t>
-            </w:r>
-            <w:r>
-              <w:rPr>
-                <w:sz w:val="18"/>
-                <w:szCs w:val="18"/>
-              </w:rPr>
-              <w:t xml:space="preserve"> date,</w:t>
-            </w:r>
+            <w:r>
+              <w:rPr>
+                <w:sz w:val="18"/>
+                <w:szCs w:val="18"/>
+              </w:rPr>
+              <w:t xml:space="preserve">id(PK) , </w:t>
+            </w:r>
+            <w:proofErr w:type="spellStart"/>
+            <w:r>
+              <w:rPr>
+                <w:sz w:val="18"/>
+                <w:szCs w:val="18"/>
+              </w:rPr>
+              <w:t>cart_id</w:t>
+            </w:r>
+            <w:proofErr w:type="spellEnd"/>
+            <w:r>
+              <w:rPr>
+                <w:sz w:val="18"/>
+                <w:szCs w:val="18"/>
+              </w:rPr>
+              <w:t xml:space="preserve">(FK), </w:t>
+            </w:r>
+            <w:proofErr w:type="spellStart"/>
+            <w:r>
+              <w:rPr>
+                <w:sz w:val="18"/>
+                <w:szCs w:val="18"/>
+              </w:rPr>
+              <w:t>product_id</w:t>
+            </w:r>
+            <w:proofErr w:type="spellEnd"/>
+            <w:r>
+              <w:rPr>
+                <w:sz w:val="18"/>
+                <w:szCs w:val="18"/>
+              </w:rPr>
+              <w:t>(FK), quantity</w:t>
+            </w:r>
+            <w:r>
+              <w:rPr>
+                <w:sz w:val="18"/>
+                <w:szCs w:val="18"/>
+              </w:rPr>
+              <w:t>, status</w:t>
+            </w:r>
+            <w:r>
+              <w:rPr>
+                <w:sz w:val="18"/>
+                <w:szCs w:val="18"/>
+              </w:rPr>
+              <w:t>[</w:t>
+            </w:r>
+            <w:proofErr w:type="spellStart"/>
+            <w:r>
+              <w:rPr>
+                <w:sz w:val="18"/>
+                <w:szCs w:val="18"/>
+              </w:rPr>
+              <w:t>hold,due,paid</w:t>
+            </w:r>
+            <w:proofErr w:type="spellEnd"/>
+            <w:r>
+              <w:rPr>
+                <w:sz w:val="18"/>
+                <w:szCs w:val="18"/>
+              </w:rPr>
+              <w:t xml:space="preserve">], </w:t>
+            </w:r>
+            <w:proofErr w:type="spellStart"/>
+            <w:r>
+              <w:rPr>
+                <w:sz w:val="18"/>
+                <w:szCs w:val="18"/>
+              </w:rPr>
+              <w:t>created_at</w:t>
+            </w:r>
+            <w:proofErr w:type="spellEnd"/>
           </w:p>
         </w:tc>
       </w:tr>
@@ -470,7 +518,7 @@
                 <w:sz w:val="18"/>
                 <w:szCs w:val="18"/>
               </w:rPr>
-              <w:t>carts</w:t>
+              <w:t>Feedback</w:t>
             </w:r>
           </w:p>
         </w:tc>
@@ -486,21 +534,28 @@
                 <w:szCs w:val="18"/>
               </w:rPr>
             </w:pPr>
-            <w:proofErr w:type="gramStart"/>
-            <w:r>
-              <w:rPr>
-                <w:sz w:val="18"/>
-                <w:szCs w:val="18"/>
-              </w:rPr>
-              <w:t>id(</w:t>
-            </w:r>
-            <w:proofErr w:type="gramEnd"/>
-            <w:r>
-              <w:rPr>
-                <w:sz w:val="18"/>
-                <w:szCs w:val="18"/>
-              </w:rPr>
-              <w:t xml:space="preserve">PK) , </w:t>
+            <w:r>
+              <w:rPr>
+                <w:sz w:val="18"/>
+                <w:szCs w:val="18"/>
+              </w:rPr>
+              <w:t xml:space="preserve">id(PK), </w:t>
+            </w:r>
+            <w:proofErr w:type="spellStart"/>
+            <w:r>
+              <w:rPr>
+                <w:sz w:val="18"/>
+                <w:szCs w:val="18"/>
+              </w:rPr>
+              <w:t>feedback_id</w:t>
+            </w:r>
+            <w:proofErr w:type="spellEnd"/>
+            <w:r>
+              <w:rPr>
+                <w:sz w:val="18"/>
+                <w:szCs w:val="18"/>
+              </w:rPr>
+              <w:t xml:space="preserve">, </w:t>
             </w:r>
             <w:proofErr w:type="spellStart"/>
             <w:r>
@@ -524,96 +579,6 @@
                 <w:sz w:val="18"/>
                 <w:szCs w:val="18"/>
               </w:rPr>
-              <w:t>created_at</w:t>
-            </w:r>
-            <w:proofErr w:type="spellEnd"/>
-            <w:r>
-              <w:rPr>
-                <w:sz w:val="18"/>
-                <w:szCs w:val="18"/>
-              </w:rPr>
-              <w:t>, status</w:t>
-            </w:r>
-          </w:p>
-        </w:tc>
-      </w:tr>
-      <w:tr>
-        <w:trPr>
-          <w:trHeight w:val="291"/>
-        </w:trPr>
-        <w:tc>
-          <w:tcPr>
-            <w:tcW w:w="2635" w:type="dxa"/>
-            <w:vAlign w:val="center"/>
-          </w:tcPr>
-          <w:p>
-            <w:pPr>
-              <w:rPr>
-                <w:sz w:val="18"/>
-                <w:szCs w:val="18"/>
-              </w:rPr>
-            </w:pPr>
-            <w:proofErr w:type="spellStart"/>
-            <w:r>
-              <w:rPr>
-                <w:sz w:val="18"/>
-                <w:szCs w:val="18"/>
-              </w:rPr>
-              <w:t>cart_Items</w:t>
-            </w:r>
-            <w:proofErr w:type="spellEnd"/>
-          </w:p>
-        </w:tc>
-        <w:tc>
-          <w:tcPr>
-            <w:tcW w:w="7525" w:type="dxa"/>
-            <w:vAlign w:val="center"/>
-          </w:tcPr>
-          <w:p>
-            <w:pPr>
-              <w:rPr>
-                <w:sz w:val="18"/>
-                <w:szCs w:val="18"/>
-              </w:rPr>
-            </w:pPr>
-            <w:proofErr w:type="gramStart"/>
-            <w:r>
-              <w:rPr>
-                <w:sz w:val="18"/>
-                <w:szCs w:val="18"/>
-              </w:rPr>
-              <w:t>id(</w:t>
-            </w:r>
-            <w:proofErr w:type="gramEnd"/>
-            <w:r>
-              <w:rPr>
-                <w:sz w:val="18"/>
-                <w:szCs w:val="18"/>
-              </w:rPr>
-              <w:t xml:space="preserve">PK), </w:t>
-            </w:r>
-            <w:proofErr w:type="spellStart"/>
-            <w:r>
-              <w:rPr>
-                <w:sz w:val="18"/>
-                <w:szCs w:val="18"/>
-              </w:rPr>
-              <w:t>cart_id</w:t>
-            </w:r>
-            <w:proofErr w:type="spellEnd"/>
-            <w:r>
-              <w:rPr>
-                <w:sz w:val="18"/>
-                <w:szCs w:val="18"/>
-              </w:rPr>
-              <w:t xml:space="preserve">(FK), </w:t>
-            </w:r>
-            <w:proofErr w:type="spellStart"/>
-            <w:r>
-              <w:rPr>
-                <w:sz w:val="18"/>
-                <w:szCs w:val="18"/>
-              </w:rPr>
               <w:t>product_id</w:t>
             </w:r>
             <w:proofErr w:type="spellEnd"/>
@@ -622,7 +587,23 @@
                 <w:sz w:val="18"/>
                 <w:szCs w:val="18"/>
               </w:rPr>
-              <w:t>(FK), quantity</w:t>
+              <w:t xml:space="preserve"> (FK), rating (1–5), </w:t>
+            </w:r>
+            <w:proofErr w:type="spellStart"/>
+            <w:r>
+              <w:rPr>
+                <w:sz w:val="18"/>
+                <w:szCs w:val="18"/>
+              </w:rPr>
+              <w:t>message,image</w:t>
+            </w:r>
+            <w:proofErr w:type="spellEnd"/>
+            <w:r>
+              <w:rPr>
+                <w:sz w:val="18"/>
+                <w:szCs w:val="18"/>
+              </w:rPr>
+              <w:t>, date,</w:t>
             </w:r>
           </w:p>
         </w:tc>
@@ -697,7 +678,6 @@
                 <w:szCs w:val="18"/>
               </w:rPr>
             </w:pPr>
-            <w:proofErr w:type="gramStart"/>
             <w:r>
               <w:rPr>
                 <w:sz w:val="18"/>
@@ -710,15 +690,7 @@
                 <w:sz w:val="18"/>
                 <w:szCs w:val="18"/>
               </w:rPr>
-              <w:t>(</w:t>
-            </w:r>
-            <w:proofErr w:type="gramEnd"/>
-            <w:r>
-              <w:rPr>
-                <w:sz w:val="18"/>
-                <w:szCs w:val="18"/>
-              </w:rPr>
-              <w:t>PK)</w:t>
+              <w:t>(PK)</w:t>
             </w:r>
             <w:r>
               <w:rPr>
@@ -793,7 +765,6 @@
                 <w:szCs w:val="18"/>
               </w:rPr>
             </w:pPr>
-            <w:proofErr w:type="gramStart"/>
             <w:r>
               <w:rPr>
                 <w:sz w:val="18"/>
@@ -806,15 +777,7 @@
                 <w:sz w:val="18"/>
                 <w:szCs w:val="18"/>
               </w:rPr>
-              <w:t>(</w:t>
-            </w:r>
-            <w:proofErr w:type="gramEnd"/>
-            <w:r>
-              <w:rPr>
-                <w:sz w:val="18"/>
-                <w:szCs w:val="18"/>
-              </w:rPr>
-              <w:t>PK)</w:t>
+              <w:t>(PK)</w:t>
             </w:r>
             <w:r>
               <w:rPr>
@@ -882,21 +845,12 @@
                 <w:szCs w:val="18"/>
               </w:rPr>
             </w:pPr>
-            <w:proofErr w:type="gramStart"/>
-            <w:r>
-              <w:rPr>
-                <w:sz w:val="18"/>
-                <w:szCs w:val="18"/>
-              </w:rPr>
-              <w:t>id(</w:t>
-            </w:r>
-            <w:proofErr w:type="gramEnd"/>
-            <w:r>
-              <w:rPr>
-                <w:sz w:val="18"/>
-                <w:szCs w:val="18"/>
-              </w:rPr>
-              <w:t xml:space="preserve">PK), </w:t>
+            <w:r>
+              <w:rPr>
+                <w:sz w:val="18"/>
+                <w:szCs w:val="18"/>
+              </w:rPr>
+              <w:t xml:space="preserve">id(PK), </w:t>
             </w:r>
             <w:proofErr w:type="spellStart"/>
             <w:r>
@@ -1015,7 +969,6 @@
                 <w:szCs w:val="18"/>
               </w:rPr>
             </w:pPr>
-            <w:proofErr w:type="gramStart"/>
             <w:r>
               <w:rPr>
                 <w:sz w:val="18"/>
@@ -1028,15 +981,7 @@
                 <w:sz w:val="18"/>
                 <w:szCs w:val="18"/>
               </w:rPr>
-              <w:t>(</w:t>
-            </w:r>
-            <w:proofErr w:type="gramEnd"/>
-            <w:r>
-              <w:rPr>
-                <w:sz w:val="18"/>
-                <w:szCs w:val="18"/>
-              </w:rPr>
-              <w:t>PK)</w:t>
+              <w:t>(PK)</w:t>
             </w:r>
             <w:r>
               <w:rPr>
@@ -1220,12 +1165,29 @@
             </w:pPr>
             <w:r>
               <w:rPr>
-                <w:rFonts w:ascii="Calibri" w:hAnsi="Calibri" w:eastAsia="Calibri" w:cs="Calibri" w:asciiTheme="minorHAnsi" w:hAnsiTheme="minorHAnsi" w:eastAsiaTheme="minorHAnsi" w:csTheme="minorBidi"/>
-                <w:kern w:val="2"/>
-                <w:sz w:val="18"/>
-                <w:szCs w:val="18"/>
-              </w:rPr>
-              <w:t>id(PK), category_name, image</w:t>
+                <w:rFonts w:cs="Calibri"/>
+                <w:sz w:val="18"/>
+                <w:szCs w:val="18"/>
+              </w:rPr>
+              <w:t xml:space="preserve">id(PK), </w:t>
+            </w:r>
+            <w:proofErr w:type="spellStart"/>
+            <w:r>
+              <w:rPr>
+                <w:rFonts w:cs="Calibri"/>
+                <w:sz w:val="18"/>
+                <w:szCs w:val="18"/>
+              </w:rPr>
+              <w:t>category_name</w:t>
+            </w:r>
+            <w:proofErr w:type="spellEnd"/>
+            <w:r>
+              <w:rPr>
+                <w:rFonts w:cs="Calibri"/>
+                <w:sz w:val="18"/>
+                <w:szCs w:val="18"/>
+              </w:rPr>
+              <w:t>, image</w:t>
             </w:r>
           </w:p>
         </w:tc>
@@ -1270,13 +1232,40 @@
             </w:pPr>
             <w:r>
               <w:rPr>
-                <w:rFonts w:ascii="Calibri" w:hAnsi="Calibri" w:eastAsia="Calibri" w:cs="Calibri" w:asciiTheme="minorHAnsi" w:hAnsiTheme="minorHAnsi" w:eastAsiaTheme="minorHAnsi" w:csTheme="minorBidi"/>
-                <w:kern w:val="2"/>
-                <w:sz w:val="18"/>
-                <w:szCs w:val="18"/>
-              </w:rPr>
-              <w:t>id(PK), barcode, name, category_id(FK), selling_price</w:t>
-            </w:r>
+                <w:rFonts w:cs="Calibri"/>
+                <w:sz w:val="18"/>
+                <w:szCs w:val="18"/>
+              </w:rPr>
+              <w:t xml:space="preserve">id(PK), barcode, name, </w:t>
+            </w:r>
+            <w:proofErr w:type="spellStart"/>
+            <w:r>
+              <w:rPr>
+                <w:rFonts w:cs="Calibri"/>
+                <w:sz w:val="18"/>
+                <w:szCs w:val="18"/>
+              </w:rPr>
+              <w:t>category_id</w:t>
+            </w:r>
+            <w:proofErr w:type="spellEnd"/>
+            <w:r>
+              <w:rPr>
+                <w:rFonts w:cs="Calibri"/>
+                <w:sz w:val="18"/>
+                <w:szCs w:val="18"/>
+              </w:rPr>
+              <w:t xml:space="preserve">(FK), </w:t>
+            </w:r>
+            <w:proofErr w:type="spellStart"/>
+            <w:r>
+              <w:rPr>
+                <w:rFonts w:cs="Calibri"/>
+                <w:sz w:val="18"/>
+                <w:szCs w:val="18"/>
+              </w:rPr>
+              <w:t>selling_price</w:t>
+            </w:r>
+            <w:proofErr w:type="spellEnd"/>
           </w:p>
         </w:tc>
       </w:tr>
@@ -1322,13 +1311,94 @@
             </w:pPr>
             <w:r>
               <w:rPr>
-                <w:rFonts w:ascii="Calibri" w:hAnsi="Calibri" w:eastAsia="Calibri" w:cs="Calibri" w:asciiTheme="minorHAnsi" w:hAnsiTheme="minorHAnsi" w:eastAsiaTheme="minorHAnsi" w:csTheme="minorBidi"/>
-                <w:kern w:val="2"/>
-                <w:sz w:val="18"/>
-                <w:szCs w:val="18"/>
-              </w:rPr>
-              <w:t>id(PK), produt_id(FK), supplier_id(FK),image, unit_cost, stock_quantity, expiry_date</w:t>
-            </w:r>
+                <w:rFonts w:cs="Calibri"/>
+                <w:sz w:val="18"/>
+                <w:szCs w:val="18"/>
+              </w:rPr>
+              <w:t xml:space="preserve">id(PK), </w:t>
+            </w:r>
+            <w:proofErr w:type="spellStart"/>
+            <w:r>
+              <w:rPr>
+                <w:rFonts w:cs="Calibri"/>
+                <w:sz w:val="18"/>
+                <w:szCs w:val="18"/>
+              </w:rPr>
+              <w:t>produt_id</w:t>
+            </w:r>
+            <w:proofErr w:type="spellEnd"/>
+            <w:r>
+              <w:rPr>
+                <w:rFonts w:cs="Calibri"/>
+                <w:sz w:val="18"/>
+                <w:szCs w:val="18"/>
+              </w:rPr>
+              <w:t xml:space="preserve">(FK), </w:t>
+            </w:r>
+            <w:proofErr w:type="spellStart"/>
+            <w:r>
+              <w:rPr>
+                <w:rFonts w:cs="Calibri"/>
+                <w:sz w:val="18"/>
+                <w:szCs w:val="18"/>
+              </w:rPr>
+              <w:t>supplier_id</w:t>
+            </w:r>
+            <w:proofErr w:type="spellEnd"/>
+            <w:r>
+              <w:rPr>
+                <w:rFonts w:cs="Calibri"/>
+                <w:sz w:val="18"/>
+                <w:szCs w:val="18"/>
+              </w:rPr>
+              <w:t xml:space="preserve">(FK),image, </w:t>
+            </w:r>
+            <w:proofErr w:type="spellStart"/>
+            <w:r>
+              <w:rPr>
+                <w:rFonts w:cs="Calibri"/>
+                <w:sz w:val="18"/>
+                <w:szCs w:val="18"/>
+              </w:rPr>
+              <w:t>unit_cost</w:t>
+            </w:r>
+            <w:proofErr w:type="spellEnd"/>
+            <w:r>
+              <w:rPr>
+                <w:rFonts w:cs="Calibri"/>
+                <w:sz w:val="18"/>
+                <w:szCs w:val="18"/>
+              </w:rPr>
+              <w:t xml:space="preserve">, </w:t>
+            </w:r>
+            <w:proofErr w:type="spellStart"/>
+            <w:r>
+              <w:rPr>
+                <w:rFonts w:cs="Calibri"/>
+                <w:sz w:val="18"/>
+                <w:szCs w:val="18"/>
+              </w:rPr>
+              <w:t>stock_quantity</w:t>
+            </w:r>
+            <w:proofErr w:type="spellEnd"/>
+            <w:r>
+              <w:rPr>
+                <w:rFonts w:cs="Calibri"/>
+                <w:sz w:val="18"/>
+                <w:szCs w:val="18"/>
+              </w:rPr>
+              <w:t xml:space="preserve">, </w:t>
+            </w:r>
+            <w:proofErr w:type="spellStart"/>
+            <w:r>
+              <w:rPr>
+                <w:rFonts w:cs="Calibri"/>
+                <w:sz w:val="18"/>
+                <w:szCs w:val="18"/>
+              </w:rPr>
+              <w:t>expiry_date</w:t>
+            </w:r>
+            <w:proofErr w:type="spellEnd"/>
           </w:p>
         </w:tc>
       </w:tr>
@@ -1398,21 +1468,12 @@
                 <w:szCs w:val="18"/>
               </w:rPr>
             </w:pPr>
-            <w:proofErr w:type="gramStart"/>
-            <w:r>
-              <w:rPr>
-                <w:sz w:val="18"/>
-                <w:szCs w:val="18"/>
-              </w:rPr>
-              <w:t>id(</w:t>
-            </w:r>
-            <w:proofErr w:type="gramEnd"/>
-            <w:r>
-              <w:rPr>
-                <w:sz w:val="18"/>
-                <w:szCs w:val="18"/>
-              </w:rPr>
-              <w:t xml:space="preserve">PK), </w:t>
+            <w:r>
+              <w:rPr>
+                <w:sz w:val="18"/>
+                <w:szCs w:val="18"/>
+              </w:rPr>
+              <w:t xml:space="preserve">id(PK), </w:t>
             </w:r>
             <w:proofErr w:type="spellStart"/>
             <w:r>
@@ -1520,21 +1581,12 @@
                 <w:szCs w:val="18"/>
               </w:rPr>
             </w:pPr>
-            <w:proofErr w:type="gramStart"/>
-            <w:r>
-              <w:rPr>
-                <w:sz w:val="18"/>
-                <w:szCs w:val="18"/>
-              </w:rPr>
-              <w:t>id(</w:t>
-            </w:r>
-            <w:proofErr w:type="gramEnd"/>
-            <w:r>
-              <w:rPr>
-                <w:sz w:val="18"/>
-                <w:szCs w:val="18"/>
-              </w:rPr>
-              <w:t xml:space="preserve">PK), </w:t>
+            <w:r>
+              <w:rPr>
+                <w:sz w:val="18"/>
+                <w:szCs w:val="18"/>
+              </w:rPr>
+              <w:t xml:space="preserve">id(PK), </w:t>
             </w:r>
             <w:proofErr w:type="spellStart"/>
             <w:r>
@@ -1655,31 +1707,15 @@
                 <w:sz w:val="18"/>
                 <w:szCs w:val="18"/>
               </w:rPr>
-              <w:t>carrier_</w:t>
-            </w:r>
-            <w:proofErr w:type="gramStart"/>
-            <w:r>
-              <w:rPr>
-                <w:sz w:val="18"/>
-                <w:szCs w:val="18"/>
-              </w:rPr>
-              <w:t>id</w:t>
-            </w:r>
-            <w:proofErr w:type="spellEnd"/>
-            <w:r>
-              <w:rPr>
-                <w:sz w:val="18"/>
-                <w:szCs w:val="18"/>
-              </w:rPr>
-              <w:t>(</w:t>
-            </w:r>
-            <w:proofErr w:type="gramEnd"/>
-            <w:r>
-              <w:rPr>
-                <w:sz w:val="18"/>
-                <w:szCs w:val="18"/>
-              </w:rPr>
-              <w:t xml:space="preserve">FK), </w:t>
+              <w:t>carrier_id</w:t>
+            </w:r>
+            <w:proofErr w:type="spellEnd"/>
+            <w:r>
+              <w:rPr>
+                <w:sz w:val="18"/>
+                <w:szCs w:val="18"/>
+              </w:rPr>
+              <w:t xml:space="preserve">(FK), </w:t>
             </w:r>
             <w:proofErr w:type="spellStart"/>
             <w:r>
@@ -1881,21 +1917,12 @@
                 <w:szCs w:val="18"/>
               </w:rPr>
             </w:pPr>
-            <w:proofErr w:type="gramStart"/>
-            <w:r>
-              <w:rPr>
-                <w:sz w:val="18"/>
-                <w:szCs w:val="18"/>
-              </w:rPr>
-              <w:t>id(</w:t>
-            </w:r>
-            <w:proofErr w:type="gramEnd"/>
-            <w:r>
-              <w:rPr>
-                <w:sz w:val="18"/>
-                <w:szCs w:val="18"/>
-              </w:rPr>
-              <w:t xml:space="preserve">PK), name, location, capacity, </w:t>
+            <w:r>
+              <w:rPr>
+                <w:sz w:val="18"/>
+                <w:szCs w:val="18"/>
+              </w:rPr>
+              <w:t xml:space="preserve">id(PK), name, location, capacity, </w:t>
             </w:r>
             <w:proofErr w:type="spellStart"/>
             <w:r>
@@ -1955,21 +1982,12 @@
                 <w:szCs w:val="18"/>
               </w:rPr>
             </w:pPr>
-            <w:proofErr w:type="gramStart"/>
-            <w:r>
-              <w:rPr>
-                <w:sz w:val="18"/>
-                <w:szCs w:val="18"/>
-              </w:rPr>
-              <w:t>id(</w:t>
-            </w:r>
-            <w:proofErr w:type="gramEnd"/>
-            <w:r>
-              <w:rPr>
-                <w:sz w:val="18"/>
-                <w:szCs w:val="18"/>
-              </w:rPr>
-              <w:t xml:space="preserve">PK), </w:t>
+            <w:r>
+              <w:rPr>
+                <w:sz w:val="18"/>
+                <w:szCs w:val="18"/>
+              </w:rPr>
+              <w:t xml:space="preserve">id(PK), </w:t>
             </w:r>
             <w:proofErr w:type="spellStart"/>
             <w:r>
@@ -2150,7 +2168,6 @@
                 <w:szCs w:val="18"/>
               </w:rPr>
             </w:pPr>
-            <w:proofErr w:type="gramStart"/>
             <w:r>
               <w:rPr>
                 <w:sz w:val="18"/>
@@ -2163,15 +2180,7 @@
                 <w:sz w:val="18"/>
                 <w:szCs w:val="18"/>
               </w:rPr>
-              <w:t>(</w:t>
-            </w:r>
-            <w:proofErr w:type="gramEnd"/>
-            <w:r>
-              <w:rPr>
-                <w:sz w:val="18"/>
-                <w:szCs w:val="18"/>
-              </w:rPr>
-              <w:t>PK)</w:t>
+              <w:t>(PK)</w:t>
             </w:r>
             <w:r>
               <w:rPr>
@@ -2270,21 +2279,12 @@
                 <w:szCs w:val="18"/>
               </w:rPr>
             </w:pPr>
-            <w:proofErr w:type="gramStart"/>
-            <w:r>
-              <w:rPr>
-                <w:sz w:val="18"/>
-                <w:szCs w:val="18"/>
-              </w:rPr>
-              <w:t>id(</w:t>
-            </w:r>
-            <w:proofErr w:type="gramEnd"/>
-            <w:r>
-              <w:rPr>
-                <w:sz w:val="18"/>
-                <w:szCs w:val="18"/>
-              </w:rPr>
-              <w:t xml:space="preserve">PK), </w:t>
+            <w:r>
+              <w:rPr>
+                <w:sz w:val="18"/>
+                <w:szCs w:val="18"/>
+              </w:rPr>
+              <w:t xml:space="preserve">id(PK), </w:t>
             </w:r>
             <w:proofErr w:type="spellStart"/>
             <w:r>
@@ -2670,7 +2670,6 @@
                 <w:szCs w:val="18"/>
               </w:rPr>
             </w:pPr>
-            <w:proofErr w:type="gramStart"/>
             <w:r>
               <w:rPr>
                 <w:sz w:val="18"/>
@@ -2683,15 +2682,7 @@
                 <w:sz w:val="18"/>
                 <w:szCs w:val="18"/>
               </w:rPr>
-              <w:t>(</w:t>
-            </w:r>
-            <w:proofErr w:type="gramEnd"/>
-            <w:r>
-              <w:rPr>
-                <w:sz w:val="18"/>
-                <w:szCs w:val="18"/>
-              </w:rPr>
-              <w:t>PK)</w:t>
+              <w:t>(PK)</w:t>
             </w:r>
             <w:r>
               <w:rPr>
@@ -2921,31 +2912,15 @@
                 <w:sz w:val="18"/>
                 <w:szCs w:val="18"/>
               </w:rPr>
-              <w:t>customer_</w:t>
-            </w:r>
-            <w:proofErr w:type="gramStart"/>
-            <w:r>
-              <w:rPr>
-                <w:sz w:val="18"/>
-                <w:szCs w:val="18"/>
-              </w:rPr>
-              <w:t>id</w:t>
-            </w:r>
-            <w:proofErr w:type="spellEnd"/>
-            <w:r>
-              <w:rPr>
-                <w:sz w:val="18"/>
-                <w:szCs w:val="18"/>
-              </w:rPr>
-              <w:t>(</w:t>
-            </w:r>
-            <w:proofErr w:type="gramEnd"/>
-            <w:r>
-              <w:rPr>
-                <w:sz w:val="18"/>
-                <w:szCs w:val="18"/>
-              </w:rPr>
-              <w:t>FK)</w:t>
+              <w:t>customer_id</w:t>
+            </w:r>
+            <w:proofErr w:type="spellEnd"/>
+            <w:r>
+              <w:rPr>
+                <w:sz w:val="18"/>
+                <w:szCs w:val="18"/>
+              </w:rPr>
+              <w:t>(FK)</w:t>
             </w:r>
             <w:r>
               <w:rPr>
@@ -3137,21 +3112,12 @@
                 <w:szCs w:val="18"/>
               </w:rPr>
             </w:pPr>
-            <w:proofErr w:type="gramStart"/>
-            <w:r>
-              <w:rPr>
-                <w:sz w:val="18"/>
-                <w:szCs w:val="18"/>
-              </w:rPr>
-              <w:t>id(</w:t>
-            </w:r>
-            <w:proofErr w:type="gramEnd"/>
-            <w:r>
-              <w:rPr>
-                <w:sz w:val="18"/>
-                <w:szCs w:val="18"/>
-              </w:rPr>
-              <w:t xml:space="preserve">PK), </w:t>
+            <w:r>
+              <w:rPr>
+                <w:sz w:val="18"/>
+                <w:szCs w:val="18"/>
+              </w:rPr>
+              <w:t xml:space="preserve">id(PK), </w:t>
             </w:r>
             <w:proofErr w:type="spellStart"/>
             <w:r>
@@ -3234,21 +3200,12 @@
                 <w:szCs w:val="18"/>
               </w:rPr>
             </w:pPr>
-            <w:proofErr w:type="gramStart"/>
-            <w:r>
-              <w:rPr>
-                <w:sz w:val="18"/>
-                <w:szCs w:val="18"/>
-              </w:rPr>
-              <w:t>id(</w:t>
-            </w:r>
-            <w:proofErr w:type="gramEnd"/>
-            <w:r>
-              <w:rPr>
-                <w:sz w:val="18"/>
-                <w:szCs w:val="18"/>
-              </w:rPr>
-              <w:t>PK)</w:t>
+            <w:r>
+              <w:rPr>
+                <w:sz w:val="18"/>
+                <w:szCs w:val="18"/>
+              </w:rPr>
+              <w:t>id(PK)</w:t>
             </w:r>
             <w:r>
               <w:rPr>
@@ -3379,21 +3336,12 @@
                 <w:szCs w:val="18"/>
               </w:rPr>
             </w:pPr>
-            <w:proofErr w:type="gramStart"/>
-            <w:r>
-              <w:rPr>
-                <w:sz w:val="18"/>
-                <w:szCs w:val="18"/>
-              </w:rPr>
-              <w:t>id(</w:t>
-            </w:r>
-            <w:proofErr w:type="gramEnd"/>
-            <w:r>
-              <w:rPr>
-                <w:sz w:val="18"/>
-                <w:szCs w:val="18"/>
-              </w:rPr>
-              <w:t xml:space="preserve">PK), category, amount, date, </w:t>
+            <w:r>
+              <w:rPr>
+                <w:sz w:val="18"/>
+                <w:szCs w:val="18"/>
+              </w:rPr>
+              <w:t xml:space="preserve">id(PK), category, amount, date, </w:t>
             </w:r>
             <w:proofErr w:type="spellStart"/>
             <w:r>
@@ -3430,21 +3378,12 @@
                 <w:szCs w:val="18"/>
               </w:rPr>
             </w:pPr>
-            <w:proofErr w:type="gramStart"/>
-            <w:r>
-              <w:rPr>
-                <w:sz w:val="18"/>
-                <w:szCs w:val="18"/>
-              </w:rPr>
-              <w:t>cogs(</w:t>
-            </w:r>
-            <w:proofErr w:type="gramEnd"/>
-            <w:r>
-              <w:rPr>
-                <w:sz w:val="18"/>
-                <w:szCs w:val="18"/>
-              </w:rPr>
-              <w:t>Cost of Goods Sold)</w:t>
+            <w:r>
+              <w:rPr>
+                <w:sz w:val="18"/>
+                <w:szCs w:val="18"/>
+              </w:rPr>
+              <w:t>cogs(Cost of Goods Sold)</w:t>
             </w:r>
           </w:p>
         </w:tc>
@@ -3826,31 +3765,15 @@
                 <w:sz w:val="18"/>
                 <w:szCs w:val="18"/>
               </w:rPr>
-              <w:t>summary_</w:t>
-            </w:r>
-            <w:proofErr w:type="gramStart"/>
-            <w:r>
-              <w:rPr>
-                <w:sz w:val="18"/>
-                <w:szCs w:val="18"/>
-              </w:rPr>
-              <w:t>date</w:t>
-            </w:r>
-            <w:proofErr w:type="spellEnd"/>
-            <w:r>
-              <w:rPr>
-                <w:sz w:val="18"/>
-                <w:szCs w:val="18"/>
-              </w:rPr>
-              <w:t>(</w:t>
-            </w:r>
-            <w:proofErr w:type="gramEnd"/>
-            <w:r>
-              <w:rPr>
-                <w:sz w:val="18"/>
-                <w:szCs w:val="18"/>
-              </w:rPr>
-              <w:t xml:space="preserve">PK), </w:t>
+              <w:t>summary_date</w:t>
+            </w:r>
+            <w:proofErr w:type="spellEnd"/>
+            <w:r>
+              <w:rPr>
+                <w:sz w:val="18"/>
+                <w:szCs w:val="18"/>
+              </w:rPr>
+              <w:t xml:space="preserve">(PK), </w:t>
             </w:r>
             <w:proofErr w:type="spellStart"/>
             <w:r>
@@ -3951,21 +3874,12 @@
                 <w:szCs w:val="18"/>
               </w:rPr>
             </w:pPr>
-            <w:proofErr w:type="gramStart"/>
-            <w:r>
-              <w:rPr>
-                <w:sz w:val="18"/>
-                <w:szCs w:val="18"/>
-              </w:rPr>
-              <w:t>id(</w:t>
-            </w:r>
-            <w:proofErr w:type="gramEnd"/>
-            <w:r>
-              <w:rPr>
-                <w:sz w:val="18"/>
-                <w:szCs w:val="18"/>
-              </w:rPr>
-              <w:t xml:space="preserve">PK), </w:t>
+            <w:r>
+              <w:rPr>
+                <w:sz w:val="18"/>
+                <w:szCs w:val="18"/>
+              </w:rPr>
+              <w:t xml:space="preserve">id(PK), </w:t>
             </w:r>
             <w:proofErr w:type="spellStart"/>
             <w:r>
@@ -4098,21 +4012,12 @@
                 <w:szCs w:val="18"/>
               </w:rPr>
             </w:pPr>
-            <w:proofErr w:type="gramStart"/>
-            <w:r>
-              <w:rPr>
-                <w:sz w:val="18"/>
-                <w:szCs w:val="18"/>
-              </w:rPr>
-              <w:t>id(</w:t>
-            </w:r>
-            <w:proofErr w:type="gramEnd"/>
-            <w:r>
-              <w:rPr>
-                <w:sz w:val="18"/>
-                <w:szCs w:val="18"/>
-              </w:rPr>
-              <w:t xml:space="preserve">PK), </w:t>
+            <w:r>
+              <w:rPr>
+                <w:sz w:val="18"/>
+                <w:szCs w:val="18"/>
+              </w:rPr>
+              <w:t xml:space="preserve">id(PK), </w:t>
             </w:r>
             <w:proofErr w:type="spellStart"/>
             <w:r>
@@ -4220,31 +4125,15 @@
                 <w:sz w:val="18"/>
                 <w:szCs w:val="18"/>
               </w:rPr>
-              <w:t>log_</w:t>
-            </w:r>
-            <w:proofErr w:type="gramStart"/>
-            <w:r>
-              <w:rPr>
-                <w:sz w:val="18"/>
-                <w:szCs w:val="18"/>
-              </w:rPr>
-              <w:t>id</w:t>
-            </w:r>
-            <w:proofErr w:type="spellEnd"/>
-            <w:r>
-              <w:rPr>
-                <w:sz w:val="18"/>
-                <w:szCs w:val="18"/>
-              </w:rPr>
-              <w:t>(</w:t>
-            </w:r>
-            <w:proofErr w:type="gramEnd"/>
-            <w:r>
-              <w:rPr>
-                <w:sz w:val="18"/>
-                <w:szCs w:val="18"/>
-              </w:rPr>
-              <w:t xml:space="preserve">PK), </w:t>
+              <w:t>log_id</w:t>
+            </w:r>
+            <w:proofErr w:type="spellEnd"/>
+            <w:r>
+              <w:rPr>
+                <w:sz w:val="18"/>
+                <w:szCs w:val="18"/>
+              </w:rPr>
+              <w:t xml:space="preserve">(PK), </w:t>
             </w:r>
             <w:proofErr w:type="spellStart"/>
             <w:r>
@@ -4517,21 +4406,12 @@
                 <w:szCs w:val="8"/>
               </w:rPr>
             </w:pPr>
-            <w:proofErr w:type="gramStart"/>
-            <w:r>
-              <w:rPr>
-                <w:sz w:val="8"/>
-                <w:szCs w:val="8"/>
-              </w:rPr>
-              <w:t>Schema::</w:t>
-            </w:r>
-            <w:proofErr w:type="gramEnd"/>
-            <w:r>
-              <w:rPr>
-                <w:sz w:val="8"/>
-                <w:szCs w:val="8"/>
-              </w:rPr>
-              <w:t>create('users', function (</w:t>
+            <w:r>
+              <w:rPr>
+                <w:sz w:val="8"/>
+                <w:szCs w:val="8"/>
+              </w:rPr>
+              <w:t>Schema::create('users', function (</w:t>
             </w:r>
             <w:r>
               <w:rPr>
@@ -4565,23 +4445,7 @@
                 <w:sz w:val="8"/>
                 <w:szCs w:val="8"/>
               </w:rPr>
-              <w:t>            $table-&gt;</w:t>
-            </w:r>
-            <w:proofErr w:type="gramStart"/>
-            <w:r>
-              <w:rPr>
-                <w:sz w:val="8"/>
-                <w:szCs w:val="8"/>
-              </w:rPr>
-              <w:t>id(</w:t>
-            </w:r>
-            <w:proofErr w:type="gramEnd"/>
-            <w:r>
-              <w:rPr>
-                <w:sz w:val="8"/>
-                <w:szCs w:val="8"/>
-              </w:rPr>
-              <w:t>);</w:t>
+              <w:t>            $table-&gt;id();</w:t>
             </w:r>
           </w:p>
           <w:p>
@@ -4633,23 +4497,7 @@
                 <w:sz w:val="8"/>
                 <w:szCs w:val="8"/>
               </w:rPr>
-              <w:t>('phone')-&gt;</w:t>
-            </w:r>
-            <w:proofErr w:type="gramStart"/>
-            <w:r>
-              <w:rPr>
-                <w:sz w:val="8"/>
-                <w:szCs w:val="8"/>
-              </w:rPr>
-              <w:t>unique(</w:t>
-            </w:r>
-            <w:proofErr w:type="gramEnd"/>
-            <w:r>
-              <w:rPr>
-                <w:sz w:val="8"/>
-                <w:szCs w:val="8"/>
-              </w:rPr>
-              <w:t>);</w:t>
+              <w:t>('phone')-&gt;unique();</w:t>
             </w:r>
           </w:p>
           <w:p>
@@ -4670,7 +4518,6 @@
               <w:t>            $table-&gt;</w:t>
             </w:r>
             <w:proofErr w:type="spellStart"/>
-            <w:proofErr w:type="gramStart"/>
             <w:r>
               <w:rPr>
                 <w:sz w:val="8"/>
@@ -4684,15 +4531,7 @@
                 <w:sz w:val="8"/>
                 <w:szCs w:val="8"/>
               </w:rPr>
-              <w:t>(</w:t>
-            </w:r>
-            <w:proofErr w:type="gramEnd"/>
-            <w:r>
-              <w:rPr>
-                <w:sz w:val="8"/>
-                <w:szCs w:val="8"/>
-              </w:rPr>
-              <w:t>'role', ['admin', 'staff', 'user'])-&gt;default('user');</w:t>
+              <w:t>('role', ['admin', 'staff', 'user'])-&gt;default('user');</w:t>
             </w:r>
           </w:p>
           <w:p>
@@ -4710,23 +4549,7 @@
                 <w:sz w:val="8"/>
                 <w:szCs w:val="8"/>
               </w:rPr>
-              <w:t>            $table-&gt;string('email')-&gt;</w:t>
-            </w:r>
-            <w:proofErr w:type="gramStart"/>
-            <w:r>
-              <w:rPr>
-                <w:sz w:val="8"/>
-                <w:szCs w:val="8"/>
-              </w:rPr>
-              <w:t>unique(</w:t>
-            </w:r>
-            <w:proofErr w:type="gramEnd"/>
-            <w:r>
-              <w:rPr>
-                <w:sz w:val="8"/>
-                <w:szCs w:val="8"/>
-              </w:rPr>
-              <w:t>);</w:t>
+              <w:t>            $table-&gt;string('email')-&gt;unique();</w:t>
             </w:r>
           </w:p>
           <w:p>
@@ -4760,23 +4583,7 @@
                 <w:sz w:val="8"/>
                 <w:szCs w:val="8"/>
               </w:rPr>
-              <w:t>')-&gt;</w:t>
-            </w:r>
-            <w:proofErr w:type="gramStart"/>
-            <w:r>
-              <w:rPr>
-                <w:sz w:val="8"/>
-                <w:szCs w:val="8"/>
-              </w:rPr>
-              <w:t>nullable(</w:t>
-            </w:r>
-            <w:proofErr w:type="gramEnd"/>
-            <w:r>
-              <w:rPr>
-                <w:sz w:val="8"/>
-                <w:szCs w:val="8"/>
-              </w:rPr>
-              <w:t>);</w:t>
+              <w:t>')-&gt;nullable();</w:t>
             </w:r>
           </w:p>
           <w:p>
@@ -4815,7 +4622,6 @@
               <w:t>            $table-&gt;</w:t>
             </w:r>
             <w:proofErr w:type="spellStart"/>
-            <w:proofErr w:type="gramStart"/>
             <w:r>
               <w:rPr>
                 <w:sz w:val="8"/>
@@ -4829,15 +4635,7 @@
                 <w:sz w:val="8"/>
                 <w:szCs w:val="8"/>
               </w:rPr>
-              <w:t>(</w:t>
-            </w:r>
-            <w:proofErr w:type="gramEnd"/>
-            <w:r>
-              <w:rPr>
-                <w:sz w:val="8"/>
-                <w:szCs w:val="8"/>
-              </w:rPr>
-              <w:t>);</w:t>
+              <w:t>();</w:t>
             </w:r>
           </w:p>
           <w:p>
@@ -4855,23 +4653,7 @@
                 <w:sz w:val="8"/>
                 <w:szCs w:val="8"/>
               </w:rPr>
-              <w:t>            $table-&gt;</w:t>
-            </w:r>
-            <w:proofErr w:type="gramStart"/>
-            <w:r>
-              <w:rPr>
-                <w:sz w:val="8"/>
-                <w:szCs w:val="8"/>
-              </w:rPr>
-              <w:t>timestamps(</w:t>
-            </w:r>
-            <w:proofErr w:type="gramEnd"/>
-            <w:r>
-              <w:rPr>
-                <w:sz w:val="8"/>
-                <w:szCs w:val="8"/>
-              </w:rPr>
-              <w:t>);</w:t>
+              <w:t>            $table-&gt;timestamps();</w:t>
             </w:r>
           </w:p>
           <w:p>
@@ -4892,7 +4674,6 @@
               <w:t>            $table-&gt;</w:t>
             </w:r>
             <w:proofErr w:type="spellStart"/>
-            <w:proofErr w:type="gramStart"/>
             <w:r>
               <w:rPr>
                 <w:sz w:val="8"/>
@@ -4906,15 +4687,7 @@
                 <w:sz w:val="8"/>
                 <w:szCs w:val="8"/>
               </w:rPr>
-              <w:t>(</w:t>
-            </w:r>
-            <w:proofErr w:type="gramEnd"/>
-            <w:r>
-              <w:rPr>
-                <w:sz w:val="8"/>
-                <w:szCs w:val="8"/>
-              </w:rPr>
-              <w:t>);</w:t>
+              <w:t>();</w:t>
             </w:r>
           </w:p>
           <w:p>
@@ -4950,21 +4723,12 @@
                 <w:szCs w:val="8"/>
               </w:rPr>
             </w:pPr>
-            <w:proofErr w:type="gramStart"/>
-            <w:r>
-              <w:rPr>
-                <w:sz w:val="8"/>
-                <w:szCs w:val="8"/>
-              </w:rPr>
-              <w:t>Schema::</w:t>
-            </w:r>
-            <w:proofErr w:type="gramEnd"/>
-            <w:r>
-              <w:rPr>
-                <w:sz w:val="8"/>
-                <w:szCs w:val="8"/>
-              </w:rPr>
-              <w:t>create('</w:t>
+            <w:r>
+              <w:rPr>
+                <w:sz w:val="8"/>
+                <w:szCs w:val="8"/>
+              </w:rPr>
+              <w:t>Schema::create('</w:t>
             </w:r>
             <w:proofErr w:type="spellStart"/>
             <w:r>
@@ -4998,23 +4762,7 @@
                 <w:sz w:val="8"/>
                 <w:szCs w:val="8"/>
               </w:rPr>
-              <w:t>            $table-&gt;</w:t>
-            </w:r>
-            <w:proofErr w:type="gramStart"/>
-            <w:r>
-              <w:rPr>
-                <w:sz w:val="8"/>
-                <w:szCs w:val="8"/>
-              </w:rPr>
-              <w:t>id(</w:t>
-            </w:r>
-            <w:proofErr w:type="gramEnd"/>
-            <w:r>
-              <w:rPr>
-                <w:sz w:val="8"/>
-                <w:szCs w:val="8"/>
-              </w:rPr>
-              <w:t>);</w:t>
+              <w:t>            $table-&gt;id();</w:t>
             </w:r>
           </w:p>
           <w:p>
@@ -5118,23 +4866,7 @@
                 <w:sz w:val="8"/>
                 <w:szCs w:val="8"/>
               </w:rPr>
-              <w:t>            $table-&gt;string('image')-&gt;</w:t>
-            </w:r>
-            <w:proofErr w:type="gramStart"/>
-            <w:r>
-              <w:rPr>
-                <w:sz w:val="8"/>
-                <w:szCs w:val="8"/>
-              </w:rPr>
-              <w:t>nullable(</w:t>
-            </w:r>
-            <w:proofErr w:type="gramEnd"/>
-            <w:r>
-              <w:rPr>
-                <w:sz w:val="8"/>
-                <w:szCs w:val="8"/>
-              </w:rPr>
-              <w:t>);</w:t>
+              <w:t>            $table-&gt;string('image')-&gt;nullable();</w:t>
             </w:r>
           </w:p>
           <w:p>
@@ -5152,23 +4884,7 @@
                 <w:sz w:val="8"/>
                 <w:szCs w:val="8"/>
               </w:rPr>
-              <w:t>            $table-&gt;</w:t>
-            </w:r>
-            <w:proofErr w:type="gramStart"/>
-            <w:r>
-              <w:rPr>
-                <w:sz w:val="8"/>
-                <w:szCs w:val="8"/>
-              </w:rPr>
-              <w:t>decimal(</w:t>
-            </w:r>
-            <w:proofErr w:type="gramEnd"/>
-            <w:r>
-              <w:rPr>
-                <w:sz w:val="8"/>
-                <w:szCs w:val="8"/>
-              </w:rPr>
-              <w:t>'</w:t>
+              <w:t>            $table-&gt;decimal('</w:t>
             </w:r>
             <w:proofErr w:type="spellStart"/>
             <w:r>
@@ -5202,23 +4918,7 @@
                 <w:sz w:val="8"/>
                 <w:szCs w:val="8"/>
               </w:rPr>
-              <w:t>            $table-&gt;integer('coins')-&gt;</w:t>
-            </w:r>
-            <w:proofErr w:type="gramStart"/>
-            <w:r>
-              <w:rPr>
-                <w:sz w:val="8"/>
-                <w:szCs w:val="8"/>
-              </w:rPr>
-              <w:t>default(</w:t>
-            </w:r>
-            <w:proofErr w:type="gramEnd"/>
-            <w:r>
-              <w:rPr>
-                <w:sz w:val="8"/>
-                <w:szCs w:val="8"/>
-              </w:rPr>
-              <w:t>0);</w:t>
+              <w:t>            $table-&gt;integer('coins')-&gt;default(0);</w:t>
             </w:r>
           </w:p>
           <w:p>
@@ -5236,23 +4936,7 @@
                 <w:sz w:val="8"/>
                 <w:szCs w:val="8"/>
               </w:rPr>
-              <w:t>            $table-&gt;</w:t>
-            </w:r>
-            <w:proofErr w:type="gramStart"/>
-            <w:r>
-              <w:rPr>
-                <w:sz w:val="8"/>
-                <w:szCs w:val="8"/>
-              </w:rPr>
-              <w:t>timestamps(</w:t>
-            </w:r>
-            <w:proofErr w:type="gramEnd"/>
-            <w:r>
-              <w:rPr>
-                <w:sz w:val="8"/>
-                <w:szCs w:val="8"/>
-              </w:rPr>
-              <w:t>);</w:t>
+              <w:t>            $table-&gt;timestamps();</w:t>
             </w:r>
           </w:p>
           <w:p>
@@ -5273,7 +4957,6 @@
               <w:t>            $table-&gt;</w:t>
             </w:r>
             <w:proofErr w:type="spellStart"/>
-            <w:proofErr w:type="gramStart"/>
             <w:r>
               <w:rPr>
                 <w:sz w:val="8"/>
@@ -5287,15 +4970,7 @@
                 <w:sz w:val="8"/>
                 <w:szCs w:val="8"/>
               </w:rPr>
-              <w:t>(</w:t>
-            </w:r>
-            <w:proofErr w:type="gramEnd"/>
-            <w:r>
-              <w:rPr>
-                <w:sz w:val="8"/>
-                <w:szCs w:val="8"/>
-              </w:rPr>
-              <w:t>);</w:t>
+              <w:t>();</w:t>
             </w:r>
           </w:p>
           <w:p>
@@ -5414,21 +5089,12 @@
                 <w:szCs w:val="8"/>
               </w:rPr>
             </w:pPr>
-            <w:proofErr w:type="gramStart"/>
-            <w:r>
-              <w:rPr>
-                <w:sz w:val="8"/>
-                <w:szCs w:val="8"/>
-              </w:rPr>
-              <w:t>Schema::</w:t>
-            </w:r>
-            <w:proofErr w:type="gramEnd"/>
-            <w:r>
-              <w:rPr>
-                <w:sz w:val="8"/>
-                <w:szCs w:val="8"/>
-              </w:rPr>
-              <w:t>create('</w:t>
+            <w:r>
+              <w:rPr>
+                <w:sz w:val="8"/>
+                <w:szCs w:val="8"/>
+              </w:rPr>
+              <w:t>Schema::create('</w:t>
             </w:r>
             <w:proofErr w:type="spellStart"/>
             <w:r>
@@ -5462,23 +5128,7 @@
                 <w:sz w:val="8"/>
                 <w:szCs w:val="8"/>
               </w:rPr>
-              <w:t>            $table-&gt;</w:t>
-            </w:r>
-            <w:proofErr w:type="gramStart"/>
-            <w:r>
-              <w:rPr>
-                <w:sz w:val="8"/>
-                <w:szCs w:val="8"/>
-              </w:rPr>
-              <w:t>id(</w:t>
-            </w:r>
-            <w:proofErr w:type="gramEnd"/>
-            <w:r>
-              <w:rPr>
-                <w:sz w:val="8"/>
-                <w:szCs w:val="8"/>
-              </w:rPr>
-              <w:t>);</w:t>
+              <w:t>            $table-&gt;id();</w:t>
             </w:r>
           </w:p>
           <w:p>
@@ -5546,23 +5196,7 @@
                 <w:sz w:val="8"/>
                 <w:szCs w:val="8"/>
               </w:rPr>
-              <w:t>')-&gt;</w:t>
-            </w:r>
-            <w:proofErr w:type="gramStart"/>
-            <w:r>
-              <w:rPr>
-                <w:sz w:val="8"/>
-                <w:szCs w:val="8"/>
-              </w:rPr>
-              <w:t>default(</w:t>
-            </w:r>
-            <w:proofErr w:type="gramEnd"/>
-            <w:r>
-              <w:rPr>
-                <w:sz w:val="8"/>
-                <w:szCs w:val="8"/>
-              </w:rPr>
-              <w:t>0);</w:t>
+              <w:t>')-&gt;default(0);</w:t>
             </w:r>
           </w:p>
           <w:p>
@@ -5580,23 +5214,7 @@
                 <w:sz w:val="8"/>
                 <w:szCs w:val="8"/>
               </w:rPr>
-              <w:t>            $table-&gt;</w:t>
-            </w:r>
-            <w:proofErr w:type="gramStart"/>
-            <w:r>
-              <w:rPr>
-                <w:sz w:val="8"/>
-                <w:szCs w:val="8"/>
-              </w:rPr>
-              <w:t>timestamps(</w:t>
-            </w:r>
-            <w:proofErr w:type="gramEnd"/>
-            <w:r>
-              <w:rPr>
-                <w:sz w:val="8"/>
-                <w:szCs w:val="8"/>
-              </w:rPr>
-              <w:t>);</w:t>
+              <w:t>            $table-&gt;timestamps();</w:t>
             </w:r>
           </w:p>
           <w:p>
@@ -5617,7 +5235,6 @@
               <w:t>            $table-&gt;</w:t>
             </w:r>
             <w:proofErr w:type="spellStart"/>
-            <w:proofErr w:type="gramStart"/>
             <w:r>
               <w:rPr>
                 <w:sz w:val="8"/>
@@ -5631,15 +5248,7 @@
                 <w:sz w:val="8"/>
                 <w:szCs w:val="8"/>
               </w:rPr>
-              <w:t>(</w:t>
-            </w:r>
-            <w:proofErr w:type="gramEnd"/>
-            <w:r>
-              <w:rPr>
-                <w:sz w:val="8"/>
-                <w:szCs w:val="8"/>
-              </w:rPr>
-              <w:t>);</w:t>
+              <w:t>();</w:t>
             </w:r>
           </w:p>
           <w:p>
@@ -5686,21 +5295,12 @@
                 <w:szCs w:val="8"/>
               </w:rPr>
             </w:pPr>
-            <w:proofErr w:type="gramStart"/>
-            <w:r>
-              <w:rPr>
-                <w:sz w:val="8"/>
-                <w:szCs w:val="8"/>
-              </w:rPr>
-              <w:t>Schema::</w:t>
-            </w:r>
-            <w:proofErr w:type="gramEnd"/>
-            <w:r>
-              <w:rPr>
-                <w:sz w:val="8"/>
-                <w:szCs w:val="8"/>
-              </w:rPr>
-              <w:t>create('employees', function (Blueprint $table) {</w:t>
+            <w:r>
+              <w:rPr>
+                <w:sz w:val="8"/>
+                <w:szCs w:val="8"/>
+              </w:rPr>
+              <w:t>Schema::create('employees', function (Blueprint $table) {</w:t>
             </w:r>
           </w:p>
           <w:p>
@@ -5718,23 +5318,7 @@
                 <w:sz w:val="8"/>
                 <w:szCs w:val="8"/>
               </w:rPr>
-              <w:t>            $table-&gt;</w:t>
-            </w:r>
-            <w:proofErr w:type="gramStart"/>
-            <w:r>
-              <w:rPr>
-                <w:sz w:val="8"/>
-                <w:szCs w:val="8"/>
-              </w:rPr>
-              <w:t>id(</w:t>
-            </w:r>
-            <w:proofErr w:type="gramEnd"/>
-            <w:r>
-              <w:rPr>
-                <w:sz w:val="8"/>
-                <w:szCs w:val="8"/>
-              </w:rPr>
-              <w:t>);</w:t>
+              <w:t>            $table-&gt;id();</w:t>
             </w:r>
           </w:p>
           <w:p>
@@ -5770,23 +5354,7 @@
                 <w:sz w:val="8"/>
                 <w:szCs w:val="8"/>
               </w:rPr>
-              <w:t>            $table-&gt;string('email')-&gt;</w:t>
-            </w:r>
-            <w:proofErr w:type="gramStart"/>
-            <w:r>
-              <w:rPr>
-                <w:sz w:val="8"/>
-                <w:szCs w:val="8"/>
-              </w:rPr>
-              <w:t>unique(</w:t>
-            </w:r>
-            <w:proofErr w:type="gramEnd"/>
-            <w:r>
-              <w:rPr>
-                <w:sz w:val="8"/>
-                <w:szCs w:val="8"/>
-              </w:rPr>
-              <w:t>);</w:t>
+              <w:t>            $table-&gt;string('email')-&gt;unique();</w:t>
             </w:r>
           </w:p>
           <w:p>
@@ -5890,23 +5458,7 @@
                 <w:sz w:val="8"/>
                 <w:szCs w:val="8"/>
               </w:rPr>
-              <w:t>            $table-&gt;</w:t>
-            </w:r>
-            <w:proofErr w:type="gramStart"/>
-            <w:r>
-              <w:rPr>
-                <w:sz w:val="8"/>
-                <w:szCs w:val="8"/>
-              </w:rPr>
-              <w:t>timestamps(</w:t>
-            </w:r>
-            <w:proofErr w:type="gramEnd"/>
-            <w:r>
-              <w:rPr>
-                <w:sz w:val="8"/>
-                <w:szCs w:val="8"/>
-              </w:rPr>
-              <w:t>);</w:t>
+              <w:t>            $table-&gt;timestamps();</w:t>
             </w:r>
           </w:p>
           <w:p>
@@ -6018,21 +5570,12 @@
                 <w:szCs w:val="8"/>
               </w:rPr>
             </w:pPr>
-            <w:proofErr w:type="gramStart"/>
-            <w:r>
-              <w:rPr>
-                <w:sz w:val="8"/>
-                <w:szCs w:val="8"/>
-              </w:rPr>
-              <w:t>Schema::</w:t>
-            </w:r>
-            <w:proofErr w:type="gramEnd"/>
-            <w:r>
-              <w:rPr>
-                <w:sz w:val="8"/>
-                <w:szCs w:val="8"/>
-              </w:rPr>
-              <w:t>create('</w:t>
+            <w:r>
+              <w:rPr>
+                <w:sz w:val="8"/>
+                <w:szCs w:val="8"/>
+              </w:rPr>
+              <w:t>Schema::create('</w:t>
             </w:r>
             <w:proofErr w:type="spellStart"/>
             <w:r>
@@ -6066,23 +5609,7 @@
                 <w:sz w:val="8"/>
                 <w:szCs w:val="8"/>
               </w:rPr>
-              <w:t>            $table-&gt;</w:t>
-            </w:r>
-            <w:proofErr w:type="gramStart"/>
-            <w:r>
-              <w:rPr>
-                <w:sz w:val="8"/>
-                <w:szCs w:val="8"/>
-              </w:rPr>
-              <w:t>id(</w:t>
-            </w:r>
-            <w:proofErr w:type="gramEnd"/>
-            <w:r>
-              <w:rPr>
-                <w:sz w:val="8"/>
-                <w:szCs w:val="8"/>
-              </w:rPr>
-              <w:t>);</w:t>
+              <w:t>            $table-&gt;id();</w:t>
             </w:r>
           </w:p>
           <w:p>
@@ -6204,23 +5731,7 @@
                 <w:sz w:val="8"/>
                 <w:szCs w:val="8"/>
               </w:rPr>
-              <w:t>            $table-&gt;string('image')-&gt;</w:t>
-            </w:r>
-            <w:proofErr w:type="gramStart"/>
-            <w:r>
-              <w:rPr>
-                <w:sz w:val="8"/>
-                <w:szCs w:val="8"/>
-              </w:rPr>
-              <w:t>nullable(</w:t>
-            </w:r>
-            <w:proofErr w:type="gramEnd"/>
-            <w:r>
-              <w:rPr>
-                <w:sz w:val="8"/>
-                <w:szCs w:val="8"/>
-              </w:rPr>
-              <w:t>);</w:t>
+              <w:t>            $table-&gt;string('image')-&gt;nullable();</w:t>
             </w:r>
           </w:p>
           <w:p>
@@ -6238,23 +5749,7 @@
                 <w:sz w:val="8"/>
                 <w:szCs w:val="8"/>
               </w:rPr>
-              <w:t>            $table-&gt;</w:t>
-            </w:r>
-            <w:proofErr w:type="gramStart"/>
-            <w:r>
-              <w:rPr>
-                <w:sz w:val="8"/>
-                <w:szCs w:val="8"/>
-              </w:rPr>
-              <w:t>decimal(</w:t>
-            </w:r>
-            <w:proofErr w:type="gramEnd"/>
-            <w:r>
-              <w:rPr>
-                <w:sz w:val="8"/>
-                <w:szCs w:val="8"/>
-              </w:rPr>
-              <w:t>'salary', 8, 2);</w:t>
+              <w:t>            $table-&gt;decimal('salary', 8, 2);</w:t>
             </w:r>
           </w:p>
           <w:p>
@@ -6272,23 +5767,7 @@
                 <w:sz w:val="8"/>
                 <w:szCs w:val="8"/>
               </w:rPr>
-              <w:t>            $table-&gt;</w:t>
-            </w:r>
-            <w:proofErr w:type="gramStart"/>
-            <w:r>
-              <w:rPr>
-                <w:sz w:val="8"/>
-                <w:szCs w:val="8"/>
-              </w:rPr>
-              <w:t>decimal(</w:t>
-            </w:r>
-            <w:proofErr w:type="gramEnd"/>
-            <w:r>
-              <w:rPr>
-                <w:sz w:val="8"/>
-                <w:szCs w:val="8"/>
-              </w:rPr>
-              <w:t>'allowance', 8, 2);</w:t>
+              <w:t>            $table-&gt;decimal('allowance', 8, 2);</w:t>
             </w:r>
           </w:p>
           <w:p>
@@ -6306,23 +5785,7 @@
                 <w:sz w:val="8"/>
                 <w:szCs w:val="8"/>
               </w:rPr>
-              <w:t>            $table-&gt;</w:t>
-            </w:r>
-            <w:proofErr w:type="gramStart"/>
-            <w:r>
-              <w:rPr>
-                <w:sz w:val="8"/>
-                <w:szCs w:val="8"/>
-              </w:rPr>
-              <w:t>decimal(</w:t>
-            </w:r>
-            <w:proofErr w:type="gramEnd"/>
-            <w:r>
-              <w:rPr>
-                <w:sz w:val="8"/>
-                <w:szCs w:val="8"/>
-              </w:rPr>
-              <w:t>'</w:t>
+              <w:t>            $table-&gt;decimal('</w:t>
             </w:r>
             <w:proofErr w:type="spellStart"/>
             <w:r>
@@ -6356,23 +5819,7 @@
                 <w:sz w:val="8"/>
                 <w:szCs w:val="8"/>
               </w:rPr>
-              <w:t>            $table-&gt;</w:t>
-            </w:r>
-            <w:proofErr w:type="gramStart"/>
-            <w:r>
-              <w:rPr>
-                <w:sz w:val="8"/>
-                <w:szCs w:val="8"/>
-              </w:rPr>
-              <w:t>decimal(</w:t>
-            </w:r>
-            <w:proofErr w:type="gramEnd"/>
-            <w:r>
-              <w:rPr>
-                <w:sz w:val="8"/>
-                <w:szCs w:val="8"/>
-              </w:rPr>
-              <w:t>'</w:t>
+              <w:t>            $table-&gt;decimal('</w:t>
             </w:r>
             <w:proofErr w:type="spellStart"/>
             <w:r>
@@ -6424,23 +5871,7 @@
                 <w:sz w:val="8"/>
                 <w:szCs w:val="8"/>
               </w:rPr>
-              <w:t>            $table-&gt;</w:t>
-            </w:r>
-            <w:proofErr w:type="gramStart"/>
-            <w:r>
-              <w:rPr>
-                <w:sz w:val="8"/>
-                <w:szCs w:val="8"/>
-              </w:rPr>
-              <w:t>timestamps(</w:t>
-            </w:r>
-            <w:proofErr w:type="gramEnd"/>
-            <w:r>
-              <w:rPr>
-                <w:sz w:val="8"/>
-                <w:szCs w:val="8"/>
-              </w:rPr>
-              <w:t>);</w:t>
+              <w:t>            $table-&gt;timestamps();</w:t>
             </w:r>
           </w:p>
           <w:p>
@@ -6461,7 +5892,6 @@
               <w:t>            $table-&gt;</w:t>
             </w:r>
             <w:proofErr w:type="spellStart"/>
-            <w:proofErr w:type="gramStart"/>
             <w:r>
               <w:rPr>
                 <w:sz w:val="8"/>
@@ -6475,15 +5905,7 @@
                 <w:sz w:val="8"/>
                 <w:szCs w:val="8"/>
               </w:rPr>
-              <w:t>(</w:t>
-            </w:r>
-            <w:proofErr w:type="gramEnd"/>
-            <w:r>
-              <w:rPr>
-                <w:sz w:val="8"/>
-                <w:szCs w:val="8"/>
-              </w:rPr>
-              <w:t>);</w:t>
+              <w:t>();</w:t>
             </w:r>
           </w:p>
           <w:p>
@@ -6530,21 +5952,12 @@
                 <w:szCs w:val="8"/>
               </w:rPr>
             </w:pPr>
-            <w:proofErr w:type="gramStart"/>
-            <w:r>
-              <w:rPr>
-                <w:sz w:val="8"/>
-                <w:szCs w:val="8"/>
-              </w:rPr>
-              <w:t>Schema::</w:t>
-            </w:r>
-            <w:proofErr w:type="gramEnd"/>
-            <w:r>
-              <w:rPr>
-                <w:sz w:val="8"/>
-                <w:szCs w:val="8"/>
-              </w:rPr>
-              <w:t>create('salaries', function (Blueprint $table) {</w:t>
+            <w:r>
+              <w:rPr>
+                <w:sz w:val="8"/>
+                <w:szCs w:val="8"/>
+              </w:rPr>
+              <w:t>Schema::create('salaries', function (Blueprint $table) {</w:t>
             </w:r>
           </w:p>
           <w:p>
@@ -6562,23 +5975,7 @@
                 <w:sz w:val="8"/>
                 <w:szCs w:val="8"/>
               </w:rPr>
-              <w:t>            $table-&gt;</w:t>
-            </w:r>
-            <w:proofErr w:type="gramStart"/>
-            <w:r>
-              <w:rPr>
-                <w:sz w:val="8"/>
-                <w:szCs w:val="8"/>
-              </w:rPr>
-              <w:t>id(</w:t>
-            </w:r>
-            <w:proofErr w:type="gramEnd"/>
-            <w:r>
-              <w:rPr>
-                <w:sz w:val="8"/>
-                <w:szCs w:val="8"/>
-              </w:rPr>
-              <w:t>);</w:t>
+              <w:t>            $table-&gt;id();</w:t>
             </w:r>
           </w:p>
           <w:p>
@@ -6714,23 +6111,7 @@
                 <w:sz w:val="8"/>
                 <w:szCs w:val="8"/>
               </w:rPr>
-              <w:t>            $table-&gt;</w:t>
-            </w:r>
-            <w:proofErr w:type="gramStart"/>
-            <w:r>
-              <w:rPr>
-                <w:sz w:val="8"/>
-                <w:szCs w:val="8"/>
-              </w:rPr>
-              <w:t>decimal(</w:t>
-            </w:r>
-            <w:proofErr w:type="gramEnd"/>
-            <w:r>
-              <w:rPr>
-                <w:sz w:val="8"/>
-                <w:szCs w:val="8"/>
-              </w:rPr>
-              <w:t>'bonus', 8, 2);</w:t>
+              <w:t>            $table-&gt;decimal('bonus', 8, 2);</w:t>
             </w:r>
           </w:p>
           <w:p>
@@ -6748,23 +6129,7 @@
                 <w:sz w:val="8"/>
                 <w:szCs w:val="8"/>
               </w:rPr>
-              <w:t>            $table-&gt;</w:t>
-            </w:r>
-            <w:proofErr w:type="gramStart"/>
-            <w:r>
-              <w:rPr>
-                <w:sz w:val="8"/>
-                <w:szCs w:val="8"/>
-              </w:rPr>
-              <w:t>decimal(</w:t>
-            </w:r>
-            <w:proofErr w:type="gramEnd"/>
-            <w:r>
-              <w:rPr>
-                <w:sz w:val="8"/>
-                <w:szCs w:val="8"/>
-              </w:rPr>
-              <w:t>'</w:t>
+              <w:t>            $table-&gt;decimal('</w:t>
             </w:r>
             <w:proofErr w:type="spellStart"/>
             <w:r>
@@ -6798,23 +6163,7 @@
                 <w:sz w:val="8"/>
                 <w:szCs w:val="8"/>
               </w:rPr>
-              <w:t>            $table-&gt;</w:t>
-            </w:r>
-            <w:proofErr w:type="gramStart"/>
-            <w:r>
-              <w:rPr>
-                <w:sz w:val="8"/>
-                <w:szCs w:val="8"/>
-              </w:rPr>
-              <w:t>decimal(</w:t>
-            </w:r>
-            <w:proofErr w:type="gramEnd"/>
-            <w:r>
-              <w:rPr>
-                <w:sz w:val="8"/>
-                <w:szCs w:val="8"/>
-              </w:rPr>
-              <w:t>'</w:t>
+              <w:t>            $table-&gt;decimal('</w:t>
             </w:r>
             <w:proofErr w:type="spellStart"/>
             <w:r>
@@ -6866,23 +6215,7 @@
                 <w:sz w:val="8"/>
                 <w:szCs w:val="8"/>
               </w:rPr>
-              <w:t>            $table-&gt;</w:t>
-            </w:r>
-            <w:proofErr w:type="gramStart"/>
-            <w:r>
-              <w:rPr>
-                <w:sz w:val="8"/>
-                <w:szCs w:val="8"/>
-              </w:rPr>
-              <w:t>timestamps(</w:t>
-            </w:r>
-            <w:proofErr w:type="gramEnd"/>
-            <w:r>
-              <w:rPr>
-                <w:sz w:val="8"/>
-                <w:szCs w:val="8"/>
-              </w:rPr>
-              <w:t>);</w:t>
+              <w:t>            $table-&gt;timestamps();</w:t>
             </w:r>
           </w:p>
           <w:p>
@@ -7345,7 +6678,6 @@
         </w:rPr>
       </w:pPr>
       <w:proofErr w:type="spellStart"/>
-      <w:proofErr w:type="gramStart"/>
       <w:r>
         <w:rPr>
           <w:sz w:val="18"/>
@@ -7364,7 +6696,6 @@
         <w:t>(</w:t>
       </w:r>
       <w:proofErr w:type="spellStart"/>
-      <w:proofErr w:type="gramEnd"/>
       <w:r>
         <w:rPr>
           <w:sz w:val="18"/>
@@ -7398,7 +6729,6 @@
         </w:rPr>
       </w:pPr>
       <w:proofErr w:type="spellStart"/>
-      <w:proofErr w:type="gramStart"/>
       <w:r>
         <w:rPr>
           <w:sz w:val="18"/>
@@ -7414,16 +6744,7 @@
           <w:szCs w:val="18"/>
           <w:highlight w:val="yellow"/>
         </w:rPr>
-        <w:t>(</w:t>
-      </w:r>
-      <w:proofErr w:type="gramEnd"/>
-      <w:r>
-        <w:rPr>
-          <w:sz w:val="18"/>
-          <w:szCs w:val="18"/>
-          <w:highlight w:val="yellow"/>
-        </w:rPr>
-        <w:t>Feedback)</w:t>
+        <w:t>(Feedback)</w:t>
       </w:r>
     </w:p>
     <w:p>
@@ -7441,7 +6762,6 @@
         </w:rPr>
       </w:pPr>
       <w:proofErr w:type="spellStart"/>
-      <w:proofErr w:type="gramStart"/>
       <w:r>
         <w:rPr>
           <w:sz w:val="18"/>
@@ -7457,16 +6777,7 @@
           <w:szCs w:val="18"/>
           <w:highlight w:val="yellow"/>
         </w:rPr>
-        <w:t>(</w:t>
-      </w:r>
-      <w:proofErr w:type="gramEnd"/>
-      <w:r>
-        <w:rPr>
-          <w:sz w:val="18"/>
-          <w:szCs w:val="18"/>
-          <w:highlight w:val="yellow"/>
-        </w:rPr>
-        <w:t>Order)</w:t>
+        <w:t>(Order)</w:t>
       </w:r>
     </w:p>
     <w:p>
@@ -7484,7 +6795,6 @@
         </w:rPr>
       </w:pPr>
       <w:proofErr w:type="spellStart"/>
-      <w:proofErr w:type="gramStart"/>
       <w:r>
         <w:rPr>
           <w:sz w:val="18"/>
@@ -7500,16 +6810,7 @@
           <w:szCs w:val="18"/>
           <w:highlight w:val="yellow"/>
         </w:rPr>
-        <w:t>(</w:t>
-      </w:r>
-      <w:proofErr w:type="gramEnd"/>
-      <w:r>
-        <w:rPr>
-          <w:sz w:val="18"/>
-          <w:szCs w:val="18"/>
-          <w:highlight w:val="yellow"/>
-        </w:rPr>
-        <w:t>Sale)</w:t>
+        <w:t>(Sale)</w:t>
       </w:r>
     </w:p>
     <w:p>
@@ -7527,7 +6828,6 @@
         </w:rPr>
       </w:pPr>
       <w:proofErr w:type="spellStart"/>
-      <w:proofErr w:type="gramStart"/>
       <w:r>
         <w:rPr>
           <w:sz w:val="18"/>
@@ -7546,7 +6846,6 @@
         <w:t>(</w:t>
       </w:r>
       <w:proofErr w:type="spellStart"/>
-      <w:proofErr w:type="gramEnd"/>
       <w:r>
         <w:rPr>
           <w:sz w:val="18"/>
@@ -7605,7 +6904,6 @@
         </w:rPr>
       </w:pPr>
       <w:proofErr w:type="spellStart"/>
-      <w:proofErr w:type="gramStart"/>
       <w:r>
         <w:rPr>
           <w:sz w:val="18"/>
@@ -7621,16 +6919,7 @@
           <w:szCs w:val="18"/>
           <w:highlight w:val="yellow"/>
         </w:rPr>
-        <w:t>(</w:t>
-      </w:r>
-      <w:proofErr w:type="gramEnd"/>
-      <w:r>
-        <w:rPr>
-          <w:sz w:val="18"/>
-          <w:szCs w:val="18"/>
-          <w:highlight w:val="yellow"/>
-        </w:rPr>
-        <w:t>User)</w:t>
+        <w:t>(User)</w:t>
       </w:r>
     </w:p>
     <w:p>
@@ -7673,7 +6962,6 @@
         </w:rPr>
       </w:pPr>
       <w:proofErr w:type="spellStart"/>
-      <w:proofErr w:type="gramStart"/>
       <w:r>
         <w:rPr>
           <w:sz w:val="18"/>
@@ -7689,16 +6977,7 @@
           <w:szCs w:val="18"/>
           <w:highlight w:val="yellow"/>
         </w:rPr>
-        <w:t>(</w:t>
-      </w:r>
-      <w:proofErr w:type="gramEnd"/>
-      <w:r>
-        <w:rPr>
-          <w:sz w:val="18"/>
-          <w:szCs w:val="18"/>
-          <w:highlight w:val="yellow"/>
-        </w:rPr>
-        <w:t>Employee)</w:t>
+        <w:t>(Employee)</w:t>
       </w:r>
     </w:p>
     <w:p>
@@ -7741,7 +7020,6 @@
         </w:rPr>
       </w:pPr>
       <w:proofErr w:type="spellStart"/>
-      <w:proofErr w:type="gramStart"/>
       <w:r>
         <w:rPr>
           <w:sz w:val="18"/>
@@ -7760,7 +7038,6 @@
         <w:t>(</w:t>
       </w:r>
       <w:proofErr w:type="spellStart"/>
-      <w:proofErr w:type="gramEnd"/>
       <w:r>
         <w:rPr>
           <w:sz w:val="18"/>
@@ -7794,7 +7071,6 @@
         </w:rPr>
       </w:pPr>
       <w:proofErr w:type="spellStart"/>
-      <w:proofErr w:type="gramStart"/>
       <w:r>
         <w:rPr>
           <w:sz w:val="18"/>
@@ -7813,7 +7089,6 @@
         <w:t>(</w:t>
       </w:r>
       <w:proofErr w:type="spellStart"/>
-      <w:proofErr w:type="gramEnd"/>
       <w:r>
         <w:rPr>
           <w:sz w:val="18"/>
@@ -7847,7 +7122,6 @@
         </w:rPr>
       </w:pPr>
       <w:proofErr w:type="spellStart"/>
-      <w:proofErr w:type="gramStart"/>
       <w:r>
         <w:rPr>
           <w:sz w:val="18"/>
@@ -7863,16 +7137,7 @@
           <w:szCs w:val="18"/>
           <w:highlight w:val="yellow"/>
         </w:rPr>
-        <w:t>(</w:t>
-      </w:r>
-      <w:proofErr w:type="gramEnd"/>
-      <w:r>
-        <w:rPr>
-          <w:sz w:val="18"/>
-          <w:szCs w:val="18"/>
-          <w:highlight w:val="yellow"/>
-        </w:rPr>
-        <w:t>Salary)</w:t>
+        <w:t>(Salary)</w:t>
       </w:r>
     </w:p>
     <w:p>
@@ -7917,7 +7182,6 @@
         </w:rPr>
       </w:pPr>
       <w:proofErr w:type="spellStart"/>
-      <w:proofErr w:type="gramStart"/>
       <w:r>
         <w:rPr>
           <w:sz w:val="18"/>
@@ -7933,16 +7197,7 @@
           <w:szCs w:val="18"/>
           <w:highlight w:val="yellow"/>
         </w:rPr>
-        <w:t>(</w:t>
-      </w:r>
-      <w:proofErr w:type="gramEnd"/>
-      <w:r>
-        <w:rPr>
-          <w:sz w:val="18"/>
-          <w:szCs w:val="18"/>
-          <w:highlight w:val="yellow"/>
-        </w:rPr>
-        <w:t>Employee)</w:t>
+        <w:t>(Employee)</w:t>
       </w:r>
     </w:p>
     <w:p>
@@ -7985,7 +7240,6 @@
         </w:rPr>
       </w:pPr>
       <w:proofErr w:type="spellStart"/>
-      <w:proofErr w:type="gramStart"/>
       <w:r>
         <w:rPr>
           <w:sz w:val="18"/>
@@ -8001,16 +7255,7 @@
           <w:szCs w:val="18"/>
           <w:highlight w:val="yellow"/>
         </w:rPr>
-        <w:t>(</w:t>
-      </w:r>
-      <w:proofErr w:type="gramEnd"/>
-      <w:r>
-        <w:rPr>
-          <w:sz w:val="18"/>
-          <w:szCs w:val="18"/>
-          <w:highlight w:val="yellow"/>
-        </w:rPr>
-        <w:t>Employee)</w:t>
+        <w:t>(Employee)</w:t>
       </w:r>
     </w:p>
     <w:p>
@@ -8204,21 +7449,12 @@
                 <w:szCs w:val="8"/>
               </w:rPr>
             </w:pPr>
-            <w:proofErr w:type="gramStart"/>
-            <w:r>
-              <w:rPr>
-                <w:sz w:val="8"/>
-                <w:szCs w:val="8"/>
-              </w:rPr>
-              <w:t>Schema::</w:t>
-            </w:r>
-            <w:proofErr w:type="gramEnd"/>
-            <w:r>
-              <w:rPr>
-                <w:sz w:val="8"/>
-                <w:szCs w:val="8"/>
-              </w:rPr>
-              <w:t>create('products', function (</w:t>
+            <w:r>
+              <w:rPr>
+                <w:sz w:val="8"/>
+                <w:szCs w:val="8"/>
+              </w:rPr>
+              <w:t>Schema::create('products', function (</w:t>
             </w:r>
             <w:r>
               <w:rPr>
@@ -8252,23 +7488,7 @@
                 <w:sz w:val="8"/>
                 <w:szCs w:val="8"/>
               </w:rPr>
-              <w:t>            $table-&gt;</w:t>
-            </w:r>
-            <w:proofErr w:type="gramStart"/>
-            <w:r>
-              <w:rPr>
-                <w:sz w:val="8"/>
-                <w:szCs w:val="8"/>
-              </w:rPr>
-              <w:t>id(</w:t>
-            </w:r>
-            <w:proofErr w:type="gramEnd"/>
-            <w:r>
-              <w:rPr>
-                <w:sz w:val="8"/>
-                <w:szCs w:val="8"/>
-              </w:rPr>
-              <w:t>);</w:t>
+              <w:t>            $table-&gt;id();</w:t>
             </w:r>
           </w:p>
           <w:p>
@@ -8372,23 +7592,7 @@
                 <w:sz w:val="8"/>
                 <w:szCs w:val="8"/>
               </w:rPr>
-              <w:t>            $table-&gt;</w:t>
-            </w:r>
-            <w:proofErr w:type="gramStart"/>
-            <w:r>
-              <w:rPr>
-                <w:sz w:val="8"/>
-                <w:szCs w:val="8"/>
-              </w:rPr>
-              <w:t>decimal(</w:t>
-            </w:r>
-            <w:proofErr w:type="gramEnd"/>
-            <w:r>
-              <w:rPr>
-                <w:sz w:val="8"/>
-                <w:szCs w:val="8"/>
-              </w:rPr>
-              <w:t>'</w:t>
+              <w:t>            $table-&gt;decimal('</w:t>
             </w:r>
             <w:proofErr w:type="spellStart"/>
             <w:r>
@@ -8422,23 +7626,7 @@
                 <w:sz w:val="8"/>
                 <w:szCs w:val="8"/>
               </w:rPr>
-              <w:t>            $table-&gt;</w:t>
-            </w:r>
-            <w:proofErr w:type="gramStart"/>
-            <w:r>
-              <w:rPr>
-                <w:sz w:val="8"/>
-                <w:szCs w:val="8"/>
-              </w:rPr>
-              <w:t>timestamps(</w:t>
-            </w:r>
-            <w:proofErr w:type="gramEnd"/>
-            <w:r>
-              <w:rPr>
-                <w:sz w:val="8"/>
-                <w:szCs w:val="8"/>
-              </w:rPr>
-              <w:t>);</w:t>
+              <w:t>            $table-&gt;timestamps();</w:t>
             </w:r>
           </w:p>
           <w:p>
@@ -8459,7 +7647,6 @@
               <w:t>            $table-&gt;</w:t>
             </w:r>
             <w:proofErr w:type="spellStart"/>
-            <w:proofErr w:type="gramStart"/>
             <w:r>
               <w:rPr>
                 <w:sz w:val="8"/>
@@ -8473,15 +7660,7 @@
                 <w:sz w:val="8"/>
                 <w:szCs w:val="8"/>
               </w:rPr>
-              <w:t>(</w:t>
-            </w:r>
-            <w:proofErr w:type="gramEnd"/>
-            <w:r>
-              <w:rPr>
-                <w:sz w:val="8"/>
-                <w:szCs w:val="8"/>
-              </w:rPr>
-              <w:t>);</w:t>
+              <w:t>();</w:t>
             </w:r>
           </w:p>
           <w:p>
@@ -9058,7 +8237,6 @@
         </w:rPr>
       </w:pPr>
       <w:proofErr w:type="spellStart"/>
-      <w:proofErr w:type="gramStart"/>
       <w:r>
         <w:rPr>
           <w:sz w:val="18"/>
@@ -9074,16 +8252,7 @@
           <w:szCs w:val="18"/>
           <w:highlight w:val="yellow"/>
         </w:rPr>
-        <w:t>(</w:t>
-      </w:r>
-      <w:proofErr w:type="gramEnd"/>
-      <w:r>
-        <w:rPr>
-          <w:sz w:val="18"/>
-          <w:szCs w:val="18"/>
-          <w:highlight w:val="yellow"/>
-        </w:rPr>
-        <w:t>Product)</w:t>
+        <w:t>(Product)</w:t>
       </w:r>
     </w:p>
     <w:p>
@@ -9124,7 +8293,6 @@
         </w:rPr>
       </w:pPr>
       <w:proofErr w:type="spellStart"/>
-      <w:proofErr w:type="gramStart"/>
       <w:r>
         <w:rPr>
           <w:sz w:val="18"/>
@@ -9143,7 +8311,6 @@
         <w:t>(</w:t>
       </w:r>
       <w:proofErr w:type="spellStart"/>
-      <w:proofErr w:type="gramEnd"/>
       <w:r>
         <w:rPr>
           <w:sz w:val="18"/>
@@ -9176,7 +8343,6 @@
         </w:rPr>
       </w:pPr>
       <w:proofErr w:type="spellStart"/>
-      <w:proofErr w:type="gramStart"/>
       <w:r>
         <w:rPr>
           <w:sz w:val="18"/>
@@ -9195,7 +8361,6 @@
         <w:t>(</w:t>
       </w:r>
       <w:proofErr w:type="spellStart"/>
-      <w:proofErr w:type="gramEnd"/>
       <w:r>
         <w:rPr>
           <w:sz w:val="18"/>
@@ -9228,7 +8393,6 @@
         </w:rPr>
       </w:pPr>
       <w:proofErr w:type="spellStart"/>
-      <w:proofErr w:type="gramStart"/>
       <w:r>
         <w:rPr>
           <w:sz w:val="18"/>
@@ -9244,16 +8408,7 @@
           <w:szCs w:val="18"/>
           <w:highlight w:val="yellow"/>
         </w:rPr>
-        <w:t>(</w:t>
-      </w:r>
-      <w:proofErr w:type="gramEnd"/>
-      <w:r>
-        <w:rPr>
-          <w:sz w:val="18"/>
-          <w:szCs w:val="18"/>
-          <w:highlight w:val="yellow"/>
-        </w:rPr>
-        <w:t>Feedback)</w:t>
+        <w:t>(Feedback)</w:t>
       </w:r>
     </w:p>
     <w:p>
@@ -9270,7 +8425,6 @@
         </w:rPr>
       </w:pPr>
       <w:proofErr w:type="spellStart"/>
-      <w:proofErr w:type="gramStart"/>
       <w:r>
         <w:rPr>
           <w:sz w:val="18"/>
@@ -9289,7 +8443,6 @@
         <w:t>(</w:t>
       </w:r>
       <w:proofErr w:type="spellStart"/>
-      <w:proofErr w:type="gramEnd"/>
       <w:r>
         <w:rPr>
           <w:sz w:val="18"/>
@@ -9322,7 +8475,6 @@
         </w:rPr>
       </w:pPr>
       <w:proofErr w:type="spellStart"/>
-      <w:proofErr w:type="gramStart"/>
       <w:r>
         <w:rPr>
           <w:sz w:val="18"/>
@@ -9341,7 +8493,6 @@
         <w:t>(</w:t>
       </w:r>
       <w:proofErr w:type="spellStart"/>
-      <w:proofErr w:type="gramEnd"/>
       <w:r>
         <w:rPr>
           <w:sz w:val="18"/>
@@ -9374,7 +8525,6 @@
         </w:rPr>
       </w:pPr>
       <w:proofErr w:type="spellStart"/>
-      <w:proofErr w:type="gramStart"/>
       <w:r>
         <w:rPr>
           <w:sz w:val="18"/>
@@ -9393,7 +8543,6 @@
         <w:t>(</w:t>
       </w:r>
       <w:proofErr w:type="spellStart"/>
-      <w:proofErr w:type="gramEnd"/>
       <w:r>
         <w:rPr>
           <w:sz w:val="18"/>
@@ -9426,7 +8575,6 @@
         </w:rPr>
       </w:pPr>
       <w:proofErr w:type="spellStart"/>
-      <w:proofErr w:type="gramStart"/>
       <w:r>
         <w:rPr>
           <w:sz w:val="18"/>
@@ -9445,7 +8593,6 @@
         <w:t>(</w:t>
       </w:r>
       <w:proofErr w:type="spellStart"/>
-      <w:proofErr w:type="gramEnd"/>
       <w:r>
         <w:rPr>
           <w:sz w:val="18"/>
@@ -9504,7 +8651,6 @@
         </w:rPr>
       </w:pPr>
       <w:proofErr w:type="spellStart"/>
-      <w:proofErr w:type="gramStart"/>
       <w:r>
         <w:rPr>
           <w:sz w:val="18"/>
@@ -9520,16 +8666,7 @@
           <w:szCs w:val="18"/>
           <w:highlight w:val="yellow"/>
         </w:rPr>
-        <w:t>(</w:t>
-      </w:r>
-      <w:proofErr w:type="gramEnd"/>
-      <w:r>
-        <w:rPr>
-          <w:sz w:val="18"/>
-          <w:szCs w:val="18"/>
-          <w:highlight w:val="yellow"/>
-        </w:rPr>
-        <w:t>Product)</w:t>
+        <w:t>(Product)</w:t>
       </w:r>
     </w:p>
     <w:p>
@@ -9546,7 +8683,6 @@
         </w:rPr>
       </w:pPr>
       <w:proofErr w:type="spellStart"/>
-      <w:proofErr w:type="gramStart"/>
       <w:r>
         <w:rPr>
           <w:sz w:val="18"/>
@@ -9562,16 +8698,7 @@
           <w:szCs w:val="18"/>
           <w:highlight w:val="yellow"/>
         </w:rPr>
-        <w:t>(</w:t>
-      </w:r>
-      <w:proofErr w:type="gramEnd"/>
-      <w:r>
-        <w:rPr>
-          <w:sz w:val="18"/>
-          <w:szCs w:val="18"/>
-          <w:highlight w:val="yellow"/>
-        </w:rPr>
-        <w:t>Supplier)</w:t>
+        <w:t>(Supplier)</w:t>
       </w:r>
     </w:p>
     <w:p>
@@ -9609,7 +8736,6 @@
         </w:rPr>
       </w:pPr>
       <w:proofErr w:type="spellStart"/>
-      <w:proofErr w:type="gramStart"/>
       <w:r>
         <w:rPr>
           <w:sz w:val="18"/>
@@ -9626,7 +8752,6 @@
         <w:t>(</w:t>
       </w:r>
       <w:proofErr w:type="spellStart"/>
-      <w:proofErr w:type="gramEnd"/>
       <w:r>
         <w:rPr>
           <w:sz w:val="18"/>
@@ -9656,7 +8781,6 @@
         </w:rPr>
       </w:pPr>
       <w:proofErr w:type="spellStart"/>
-      <w:proofErr w:type="gramStart"/>
       <w:r>
         <w:rPr>
           <w:sz w:val="18"/>
@@ -9673,7 +8797,6 @@
         <w:t>(</w:t>
       </w:r>
       <w:proofErr w:type="spellStart"/>
-      <w:proofErr w:type="gramEnd"/>
       <w:r>
         <w:rPr>
           <w:sz w:val="18"/>
@@ -9703,7 +8826,6 @@
         </w:rPr>
       </w:pPr>
       <w:proofErr w:type="spellStart"/>
-      <w:proofErr w:type="gramStart"/>
       <w:r>
         <w:rPr>
           <w:sz w:val="18"/>
@@ -9717,15 +8839,7 @@
           <w:sz w:val="18"/>
           <w:szCs w:val="18"/>
         </w:rPr>
-        <w:t>(</w:t>
-      </w:r>
-      <w:proofErr w:type="gramEnd"/>
-      <w:r>
-        <w:rPr>
-          <w:sz w:val="18"/>
-          <w:szCs w:val="18"/>
-        </w:rPr>
-        <w:t>Employee, '</w:t>
+        <w:t>(Employee, '</w:t>
       </w:r>
       <w:proofErr w:type="spellStart"/>
       <w:r>
@@ -9781,7 +8895,6 @@
         </w:rPr>
       </w:pPr>
       <w:proofErr w:type="spellStart"/>
-      <w:proofErr w:type="gramStart"/>
       <w:r>
         <w:rPr>
           <w:sz w:val="18"/>
@@ -9795,15 +8908,7 @@
           <w:sz w:val="18"/>
           <w:szCs w:val="18"/>
         </w:rPr>
-        <w:t>(</w:t>
-      </w:r>
-      <w:proofErr w:type="gramEnd"/>
-      <w:r>
-        <w:rPr>
-          <w:sz w:val="18"/>
-          <w:szCs w:val="18"/>
-        </w:rPr>
-        <w:t>Warehouse)</w:t>
+        <w:t>(Warehouse)</w:t>
       </w:r>
     </w:p>
     <w:p>
@@ -9819,7 +8924,6 @@
         </w:rPr>
       </w:pPr>
       <w:proofErr w:type="spellStart"/>
-      <w:proofErr w:type="gramStart"/>
       <w:r>
         <w:rPr>
           <w:sz w:val="18"/>
@@ -9833,15 +8937,7 @@
           <w:sz w:val="18"/>
           <w:szCs w:val="18"/>
         </w:rPr>
-        <w:t>(</w:t>
-      </w:r>
-      <w:proofErr w:type="gramEnd"/>
-      <w:r>
-        <w:rPr>
-          <w:sz w:val="18"/>
-          <w:szCs w:val="18"/>
-        </w:rPr>
-        <w:t>Product)</w:t>
+        <w:t>(Product)</w:t>
       </w:r>
     </w:p>
     <w:p>
@@ -10029,23 +9125,7 @@
                 <w:sz w:val="8"/>
                 <w:szCs w:val="8"/>
               </w:rPr>
-              <w:t xml:space="preserve">        </w:t>
-            </w:r>
-            <w:proofErr w:type="gramStart"/>
-            <w:r>
-              <w:rPr>
-                <w:sz w:val="8"/>
-                <w:szCs w:val="8"/>
-              </w:rPr>
-              <w:t>Schema::</w:t>
-            </w:r>
-            <w:proofErr w:type="gramEnd"/>
-            <w:r>
-              <w:rPr>
-                <w:sz w:val="8"/>
-                <w:szCs w:val="8"/>
-              </w:rPr>
-              <w:t>create('orders', function (</w:t>
+              <w:t>        Schema::create('orders', function (</w:t>
             </w:r>
             <w:r>
               <w:rPr>
@@ -10079,23 +9159,7 @@
                 <w:sz w:val="8"/>
                 <w:szCs w:val="8"/>
               </w:rPr>
-              <w:t>            $table-&gt;</w:t>
-            </w:r>
-            <w:proofErr w:type="gramStart"/>
-            <w:r>
-              <w:rPr>
-                <w:sz w:val="8"/>
-                <w:szCs w:val="8"/>
-              </w:rPr>
-              <w:t>id(</w:t>
-            </w:r>
-            <w:proofErr w:type="gramEnd"/>
-            <w:r>
-              <w:rPr>
-                <w:sz w:val="8"/>
-                <w:szCs w:val="8"/>
-              </w:rPr>
-              <w:t>);</w:t>
+              <w:t>            $table-&gt;id();</w:t>
             </w:r>
           </w:p>
           <w:p>
@@ -10181,23 +9245,7 @@
                 <w:sz w:val="8"/>
                 <w:szCs w:val="8"/>
               </w:rPr>
-              <w:t>            $table-&gt;</w:t>
-            </w:r>
-            <w:proofErr w:type="gramStart"/>
-            <w:r>
-              <w:rPr>
-                <w:sz w:val="8"/>
-                <w:szCs w:val="8"/>
-              </w:rPr>
-              <w:t>decimal(</w:t>
-            </w:r>
-            <w:proofErr w:type="gramEnd"/>
-            <w:r>
-              <w:rPr>
-                <w:sz w:val="8"/>
-                <w:szCs w:val="8"/>
-              </w:rPr>
-              <w:t>'</w:t>
+              <w:t>            $table-&gt;decimal('</w:t>
             </w:r>
             <w:proofErr w:type="spellStart"/>
             <w:r>
@@ -10231,23 +9279,7 @@
                 <w:sz w:val="8"/>
                 <w:szCs w:val="8"/>
               </w:rPr>
-              <w:t>            $table-&gt;</w:t>
-            </w:r>
-            <w:proofErr w:type="gramStart"/>
-            <w:r>
-              <w:rPr>
-                <w:sz w:val="8"/>
-                <w:szCs w:val="8"/>
-              </w:rPr>
-              <w:t>timestamps(</w:t>
-            </w:r>
-            <w:proofErr w:type="gramEnd"/>
-            <w:r>
-              <w:rPr>
-                <w:sz w:val="8"/>
-                <w:szCs w:val="8"/>
-              </w:rPr>
-              <w:t>);</w:t>
+              <w:t>            $table-&gt;timestamps();</w:t>
             </w:r>
           </w:p>
           <w:p>
@@ -11331,7 +10363,6 @@
         </w:rPr>
       </w:pPr>
       <w:proofErr w:type="spellStart"/>
-      <w:proofErr w:type="gramStart"/>
       <w:r>
         <w:rPr>
           <w:sz w:val="18"/>
@@ -11345,15 +10376,7 @@
           <w:sz w:val="18"/>
           <w:szCs w:val="18"/>
         </w:rPr>
-        <w:t>(</w:t>
-      </w:r>
-      <w:proofErr w:type="gramEnd"/>
-      <w:r>
-        <w:rPr>
-          <w:sz w:val="18"/>
-          <w:szCs w:val="18"/>
-        </w:rPr>
-        <w:t>User, '</w:t>
+        <w:t>(User, '</w:t>
       </w:r>
       <w:proofErr w:type="spellStart"/>
       <w:r>
@@ -11385,7 +10408,6 @@
         </w:rPr>
       </w:pPr>
       <w:proofErr w:type="spellStart"/>
-      <w:proofErr w:type="gramStart"/>
       <w:r>
         <w:rPr>
           <w:sz w:val="18"/>
@@ -11402,7 +10424,6 @@
         <w:t>(</w:t>
       </w:r>
       <w:proofErr w:type="spellStart"/>
-      <w:proofErr w:type="gramEnd"/>
       <w:r>
         <w:rPr>
           <w:sz w:val="18"/>
@@ -11465,7 +10486,6 @@
         </w:rPr>
       </w:pPr>
       <w:proofErr w:type="spellStart"/>
-      <w:proofErr w:type="gramStart"/>
       <w:r>
         <w:rPr>
           <w:sz w:val="18"/>
@@ -11479,15 +10499,7 @@
           <w:sz w:val="18"/>
           <w:szCs w:val="18"/>
         </w:rPr>
-        <w:t>(</w:t>
-      </w:r>
-      <w:proofErr w:type="gramEnd"/>
-      <w:r>
-        <w:rPr>
-          <w:sz w:val="18"/>
-          <w:szCs w:val="18"/>
-        </w:rPr>
-        <w:t>Cart)</w:t>
+        <w:t>(Cart)</w:t>
       </w:r>
     </w:p>
     <w:p>
@@ -11503,7 +10515,6 @@
         </w:rPr>
       </w:pPr>
       <w:proofErr w:type="spellStart"/>
-      <w:proofErr w:type="gramStart"/>
       <w:r>
         <w:rPr>
           <w:sz w:val="18"/>
@@ -11517,15 +10528,7 @@
           <w:sz w:val="18"/>
           <w:szCs w:val="18"/>
         </w:rPr>
-        <w:t>(</w:t>
-      </w:r>
-      <w:proofErr w:type="gramEnd"/>
-      <w:r>
-        <w:rPr>
-          <w:sz w:val="18"/>
-          <w:szCs w:val="18"/>
-        </w:rPr>
-        <w:t>Product)</w:t>
+        <w:t>(Product)</w:t>
       </w:r>
     </w:p>
     <w:p>
@@ -11564,7 +10567,6 @@
         </w:rPr>
       </w:pPr>
       <w:proofErr w:type="spellStart"/>
-      <w:proofErr w:type="gramStart"/>
       <w:r>
         <w:rPr>
           <w:sz w:val="18"/>
@@ -11580,16 +10582,7 @@
           <w:szCs w:val="18"/>
           <w:highlight w:val="yellow"/>
         </w:rPr>
-        <w:t>(</w:t>
-      </w:r>
-      <w:proofErr w:type="gramEnd"/>
-      <w:r>
-        <w:rPr>
-          <w:sz w:val="18"/>
-          <w:szCs w:val="18"/>
-          <w:highlight w:val="yellow"/>
-        </w:rPr>
-        <w:t>User, '</w:t>
+        <w:t>(User, '</w:t>
       </w:r>
       <w:proofErr w:type="spellStart"/>
       <w:r>
@@ -11624,7 +10617,6 @@
         </w:rPr>
       </w:pPr>
       <w:proofErr w:type="spellStart"/>
-      <w:proofErr w:type="gramStart"/>
       <w:r>
         <w:rPr>
           <w:sz w:val="18"/>
@@ -11643,7 +10635,6 @@
         <w:t>(</w:t>
       </w:r>
       <w:proofErr w:type="spellStart"/>
-      <w:proofErr w:type="gramEnd"/>
       <w:r>
         <w:rPr>
           <w:sz w:val="18"/>
@@ -11676,7 +10667,6 @@
         </w:rPr>
       </w:pPr>
       <w:proofErr w:type="spellStart"/>
-      <w:proofErr w:type="gramStart"/>
       <w:r>
         <w:rPr>
           <w:sz w:val="18"/>
@@ -11695,7 +10685,6 @@
         <w:t>(</w:t>
       </w:r>
       <w:proofErr w:type="spellStart"/>
-      <w:proofErr w:type="gramEnd"/>
       <w:r>
         <w:rPr>
           <w:sz w:val="18"/>
@@ -11728,7 +10717,6 @@
         </w:rPr>
       </w:pPr>
       <w:proofErr w:type="spellStart"/>
-      <w:proofErr w:type="gramStart"/>
       <w:r>
         <w:rPr>
           <w:sz w:val="18"/>
@@ -11747,7 +10735,6 @@
         <w:t>(</w:t>
       </w:r>
       <w:proofErr w:type="spellStart"/>
-      <w:proofErr w:type="gramEnd"/>
       <w:r>
         <w:rPr>
           <w:sz w:val="18"/>
@@ -11780,7 +10767,6 @@
         </w:rPr>
       </w:pPr>
       <w:proofErr w:type="spellStart"/>
-      <w:proofErr w:type="gramStart"/>
       <w:r>
         <w:rPr>
           <w:sz w:val="18"/>
@@ -11796,16 +10782,7 @@
           <w:szCs w:val="18"/>
           <w:highlight w:val="yellow"/>
         </w:rPr>
-        <w:t>(</w:t>
-      </w:r>
-      <w:proofErr w:type="gramEnd"/>
-      <w:r>
-        <w:rPr>
-          <w:sz w:val="18"/>
-          <w:szCs w:val="18"/>
-          <w:highlight w:val="yellow"/>
-        </w:rPr>
-        <w:t>Invoice)</w:t>
+        <w:t>(Invoice)</w:t>
       </w:r>
     </w:p>
     <w:p>
@@ -11845,7 +10822,6 @@
         </w:rPr>
       </w:pPr>
       <w:proofErr w:type="spellStart"/>
-      <w:proofErr w:type="gramStart"/>
       <w:r>
         <w:rPr>
           <w:sz w:val="18"/>
@@ -11859,15 +10835,7 @@
           <w:sz w:val="18"/>
           <w:szCs w:val="18"/>
         </w:rPr>
-        <w:t>(</w:t>
-      </w:r>
-      <w:proofErr w:type="gramEnd"/>
-      <w:r>
-        <w:rPr>
-          <w:sz w:val="18"/>
-          <w:szCs w:val="18"/>
-        </w:rPr>
-        <w:t>Order)</w:t>
+        <w:t>(Order)</w:t>
       </w:r>
     </w:p>
     <w:p>
@@ -11883,7 +10851,6 @@
         </w:rPr>
       </w:pPr>
       <w:proofErr w:type="spellStart"/>
-      <w:proofErr w:type="gramStart"/>
       <w:r>
         <w:rPr>
           <w:sz w:val="18"/>
@@ -11897,15 +10864,7 @@
           <w:sz w:val="18"/>
           <w:szCs w:val="18"/>
         </w:rPr>
-        <w:t>(</w:t>
-      </w:r>
-      <w:proofErr w:type="gramEnd"/>
-      <w:r>
-        <w:rPr>
-          <w:sz w:val="18"/>
-          <w:szCs w:val="18"/>
-        </w:rPr>
-        <w:t>Product)</w:t>
+        <w:t>(Product)</w:t>
       </w:r>
     </w:p>
     <w:p>
@@ -11945,7 +10904,6 @@
         </w:rPr>
       </w:pPr>
       <w:proofErr w:type="spellStart"/>
-      <w:proofErr w:type="gramStart"/>
       <w:r>
         <w:rPr>
           <w:sz w:val="18"/>
@@ -11959,15 +10917,7 @@
           <w:sz w:val="18"/>
           <w:szCs w:val="18"/>
         </w:rPr>
-        <w:t>(</w:t>
-      </w:r>
-      <w:proofErr w:type="gramEnd"/>
-      <w:r>
-        <w:rPr>
-          <w:sz w:val="18"/>
-          <w:szCs w:val="18"/>
-        </w:rPr>
-        <w:t>Order)</w:t>
+        <w:t>(Order)</w:t>
       </w:r>
     </w:p>
     <w:p>
@@ -11983,7 +10933,6 @@
         </w:rPr>
       </w:pPr>
       <w:proofErr w:type="spellStart"/>
-      <w:proofErr w:type="gramStart"/>
       <w:r>
         <w:rPr>
           <w:sz w:val="18"/>
@@ -11997,15 +10946,7 @@
           <w:sz w:val="18"/>
           <w:szCs w:val="18"/>
         </w:rPr>
-        <w:t>(</w:t>
-      </w:r>
-      <w:proofErr w:type="gramEnd"/>
-      <w:r>
-        <w:rPr>
-          <w:sz w:val="18"/>
-          <w:szCs w:val="18"/>
-        </w:rPr>
-        <w:t>Employee, '</w:t>
+        <w:t>(Employee, '</w:t>
       </w:r>
       <w:proofErr w:type="spellStart"/>
       <w:r>
@@ -12061,7 +11002,6 @@
         </w:rPr>
       </w:pPr>
       <w:proofErr w:type="spellStart"/>
-      <w:proofErr w:type="gramStart"/>
       <w:r>
         <w:rPr>
           <w:sz w:val="18"/>
@@ -12075,15 +11015,7 @@
           <w:sz w:val="18"/>
           <w:szCs w:val="18"/>
         </w:rPr>
-        <w:t>(</w:t>
-      </w:r>
-      <w:proofErr w:type="gramEnd"/>
-      <w:r>
-        <w:rPr>
-          <w:sz w:val="18"/>
-          <w:szCs w:val="18"/>
-        </w:rPr>
-        <w:t>Order)</w:t>
+        <w:t>(Order)</w:t>
       </w:r>
     </w:p>
     <w:p>
@@ -12121,7 +11053,6 @@
         </w:rPr>
       </w:pPr>
       <w:proofErr w:type="spellStart"/>
-      <w:proofErr w:type="gramStart"/>
       <w:r>
         <w:rPr>
           <w:sz w:val="18"/>
@@ -12135,15 +11066,7 @@
           <w:sz w:val="18"/>
           <w:szCs w:val="18"/>
         </w:rPr>
-        <w:t>(</w:t>
-      </w:r>
-      <w:proofErr w:type="gramEnd"/>
-      <w:r>
-        <w:rPr>
-          <w:sz w:val="18"/>
-          <w:szCs w:val="18"/>
-        </w:rPr>
-        <w:t>User, '</w:t>
+        <w:t>(User, '</w:t>
       </w:r>
       <w:proofErr w:type="spellStart"/>
       <w:r>
@@ -12175,7 +11098,6 @@
         </w:rPr>
       </w:pPr>
       <w:proofErr w:type="spellStart"/>
-      <w:proofErr w:type="gramStart"/>
       <w:r>
         <w:rPr>
           <w:sz w:val="18"/>
@@ -12192,7 +11114,6 @@
         <w:t>(</w:t>
       </w:r>
       <w:proofErr w:type="spellStart"/>
-      <w:proofErr w:type="gramEnd"/>
       <w:r>
         <w:rPr>
           <w:sz w:val="18"/>
@@ -12222,7 +11143,6 @@
         </w:rPr>
       </w:pPr>
       <w:proofErr w:type="spellStart"/>
-      <w:proofErr w:type="gramStart"/>
       <w:r>
         <w:rPr>
           <w:sz w:val="18"/>
@@ -12236,15 +11156,7 @@
           <w:sz w:val="18"/>
           <w:szCs w:val="18"/>
         </w:rPr>
-        <w:t>(</w:t>
-      </w:r>
-      <w:proofErr w:type="gramEnd"/>
-      <w:r>
-        <w:rPr>
-          <w:sz w:val="18"/>
-          <w:szCs w:val="18"/>
-        </w:rPr>
-        <w:t>Revenue)</w:t>
+        <w:t>(Revenue)</w:t>
       </w:r>
     </w:p>
     <w:p>
@@ -12260,7 +11172,6 @@
         </w:rPr>
       </w:pPr>
       <w:proofErr w:type="spellStart"/>
-      <w:proofErr w:type="gramStart"/>
       <w:r>
         <w:rPr>
           <w:sz w:val="18"/>
@@ -12274,15 +11185,7 @@
           <w:sz w:val="18"/>
           <w:szCs w:val="18"/>
         </w:rPr>
-        <w:t>(</w:t>
-      </w:r>
-      <w:proofErr w:type="gramEnd"/>
-      <w:r>
-        <w:rPr>
-          <w:sz w:val="18"/>
-          <w:szCs w:val="18"/>
-        </w:rPr>
-        <w:t>COGS)</w:t>
+        <w:t>(COGS)</w:t>
       </w:r>
     </w:p>
     <w:p>
@@ -12322,7 +11225,6 @@
         </w:rPr>
       </w:pPr>
       <w:proofErr w:type="spellStart"/>
-      <w:proofErr w:type="gramStart"/>
       <w:r>
         <w:rPr>
           <w:sz w:val="18"/>
@@ -12336,15 +11238,7 @@
           <w:sz w:val="18"/>
           <w:szCs w:val="18"/>
         </w:rPr>
-        <w:t>(</w:t>
-      </w:r>
-      <w:proofErr w:type="gramEnd"/>
-      <w:r>
-        <w:rPr>
-          <w:sz w:val="18"/>
-          <w:szCs w:val="18"/>
-        </w:rPr>
-        <w:t>Sale)</w:t>
+        <w:t>(Sale)</w:t>
       </w:r>
     </w:p>
     <w:p>
@@ -12360,7 +11254,6 @@
         </w:rPr>
       </w:pPr>
       <w:proofErr w:type="spellStart"/>
-      <w:proofErr w:type="gramStart"/>
       <w:r>
         <w:rPr>
           <w:sz w:val="18"/>
@@ -12374,15 +11267,7 @@
           <w:sz w:val="18"/>
           <w:szCs w:val="18"/>
         </w:rPr>
-        <w:t>(</w:t>
-      </w:r>
-      <w:proofErr w:type="gramEnd"/>
-      <w:r>
-        <w:rPr>
-          <w:sz w:val="18"/>
-          <w:szCs w:val="18"/>
-        </w:rPr>
-        <w:t>Product)</w:t>
+        <w:t>(Product)</w:t>
       </w:r>
     </w:p>
     <w:p>
@@ -12420,7 +11305,6 @@
         </w:rPr>
       </w:pPr>
       <w:proofErr w:type="spellStart"/>
-      <w:proofErr w:type="gramStart"/>
       <w:r>
         <w:rPr>
           <w:sz w:val="18"/>
@@ -12434,15 +11318,7 @@
           <w:sz w:val="18"/>
           <w:szCs w:val="18"/>
         </w:rPr>
-        <w:t>(</w:t>
-      </w:r>
-      <w:proofErr w:type="gramEnd"/>
-      <w:r>
-        <w:rPr>
-          <w:sz w:val="18"/>
-          <w:szCs w:val="18"/>
-        </w:rPr>
-        <w:t>User, '</w:t>
+        <w:t>(User, '</w:t>
       </w:r>
       <w:proofErr w:type="spellStart"/>
       <w:r>
@@ -12474,7 +11350,6 @@
         </w:rPr>
       </w:pPr>
       <w:proofErr w:type="spellStart"/>
-      <w:proofErr w:type="gramStart"/>
       <w:r>
         <w:rPr>
           <w:sz w:val="18"/>
@@ -12488,15 +11363,7 @@
           <w:sz w:val="18"/>
           <w:szCs w:val="18"/>
         </w:rPr>
-        <w:t>(</w:t>
-      </w:r>
-      <w:proofErr w:type="gramEnd"/>
-      <w:r>
-        <w:rPr>
-          <w:sz w:val="18"/>
-          <w:szCs w:val="18"/>
-        </w:rPr>
-        <w:t xml:space="preserve">Order) or </w:t>
+        <w:t xml:space="preserve">(Order) or </w:t>
       </w:r>
       <w:proofErr w:type="spellStart"/>
       <w:r>
@@ -12528,7 +11395,6 @@
         </w:rPr>
       </w:pPr>
       <w:proofErr w:type="spellStart"/>
-      <w:proofErr w:type="gramStart"/>
       <w:r>
         <w:rPr>
           <w:sz w:val="18"/>
@@ -12545,7 +11411,6 @@
         <w:t>(</w:t>
       </w:r>
       <w:proofErr w:type="spellStart"/>
-      <w:proofErr w:type="gramEnd"/>
       <w:r>
         <w:rPr>
           <w:sz w:val="18"/>
@@ -12575,7 +11440,6 @@
         </w:rPr>
       </w:pPr>
       <w:proofErr w:type="spellStart"/>
-      <w:proofErr w:type="gramStart"/>
       <w:r>
         <w:rPr>
           <w:sz w:val="18"/>
@@ -12589,15 +11453,7 @@
           <w:sz w:val="18"/>
           <w:szCs w:val="18"/>
         </w:rPr>
-        <w:t>(</w:t>
-      </w:r>
-      <w:proofErr w:type="gramEnd"/>
-      <w:r>
-        <w:rPr>
-          <w:sz w:val="18"/>
-          <w:szCs w:val="18"/>
-        </w:rPr>
-        <w:t>Payment)</w:t>
+        <w:t>(Payment)</w:t>
       </w:r>
     </w:p>
     <w:p>
@@ -12637,7 +11493,6 @@
         </w:rPr>
       </w:pPr>
       <w:proofErr w:type="spellStart"/>
-      <w:proofErr w:type="gramStart"/>
       <w:r>
         <w:rPr>
           <w:sz w:val="18"/>
@@ -12651,15 +11506,7 @@
           <w:sz w:val="18"/>
           <w:szCs w:val="18"/>
         </w:rPr>
-        <w:t>(</w:t>
-      </w:r>
-      <w:proofErr w:type="gramEnd"/>
-      <w:r>
-        <w:rPr>
-          <w:sz w:val="18"/>
-          <w:szCs w:val="18"/>
-        </w:rPr>
-        <w:t>Invoice)</w:t>
+        <w:t>(Invoice)</w:t>
       </w:r>
     </w:p>
     <w:p>
@@ -12675,7 +11522,6 @@
         </w:rPr>
       </w:pPr>
       <w:proofErr w:type="spellStart"/>
-      <w:proofErr w:type="gramStart"/>
       <w:r>
         <w:rPr>
           <w:sz w:val="18"/>
@@ -12690,15 +11536,7 @@
           <w:sz w:val="18"/>
           <w:szCs w:val="18"/>
         </w:rPr>
-        <w:t>(</w:t>
-      </w:r>
-      <w:proofErr w:type="gramEnd"/>
-      <w:r>
-        <w:rPr>
-          <w:sz w:val="18"/>
-          <w:szCs w:val="18"/>
-        </w:rPr>
-        <w:t>Product)</w:t>
+        <w:t>(Product)</w:t>
       </w:r>
     </w:p>
     <w:p>
@@ -12736,7 +11574,6 @@
         </w:rPr>
       </w:pPr>
       <w:proofErr w:type="spellStart"/>
-      <w:proofErr w:type="gramStart"/>
       <w:r>
         <w:rPr>
           <w:sz w:val="18"/>
@@ -12750,15 +11587,7 @@
           <w:sz w:val="18"/>
           <w:szCs w:val="18"/>
         </w:rPr>
-        <w:t>(</w:t>
-      </w:r>
-      <w:proofErr w:type="gramEnd"/>
-      <w:r>
-        <w:rPr>
-          <w:sz w:val="18"/>
-          <w:szCs w:val="18"/>
-        </w:rPr>
-        <w:t>Invoice)</w:t>
+        <w:t>(Invoice)</w:t>
       </w:r>
     </w:p>
     <w:p>
@@ -13265,7 +12094,6 @@
         </w:rPr>
       </w:pPr>
       <w:proofErr w:type="spellStart"/>
-      <w:proofErr w:type="gramStart"/>
       <w:r>
         <w:rPr>
           <w:sz w:val="18"/>
@@ -13284,7 +12112,6 @@
         <w:t>(</w:t>
       </w:r>
       <w:proofErr w:type="spellStart"/>
-      <w:proofErr w:type="gramEnd"/>
       <w:r>
         <w:rPr>
           <w:sz w:val="18"/>
@@ -13317,7 +12144,6 @@
         </w:rPr>
       </w:pPr>
       <w:proofErr w:type="spellStart"/>
-      <w:proofErr w:type="gramStart"/>
       <w:r>
         <w:rPr>
           <w:sz w:val="18"/>
@@ -13336,7 +12162,6 @@
         <w:t>(</w:t>
       </w:r>
       <w:proofErr w:type="spellStart"/>
-      <w:proofErr w:type="gramEnd"/>
       <w:r>
         <w:rPr>
           <w:sz w:val="18"/>
@@ -13369,7 +12194,6 @@
         </w:rPr>
       </w:pPr>
       <w:proofErr w:type="spellStart"/>
-      <w:proofErr w:type="gramStart"/>
       <w:r>
         <w:rPr>
           <w:sz w:val="18"/>
@@ -13388,7 +12212,6 @@
         <w:t>(</w:t>
       </w:r>
       <w:proofErr w:type="spellStart"/>
-      <w:proofErr w:type="gramEnd"/>
       <w:r>
         <w:rPr>
           <w:sz w:val="18"/>
@@ -13444,7 +12267,6 @@
         </w:rPr>
       </w:pPr>
       <w:proofErr w:type="spellStart"/>
-      <w:proofErr w:type="gramStart"/>
       <w:r>
         <w:rPr>
           <w:sz w:val="18"/>
@@ -13458,15 +12280,7 @@
           <w:sz w:val="18"/>
           <w:szCs w:val="18"/>
         </w:rPr>
-        <w:t>(</w:t>
-      </w:r>
-      <w:proofErr w:type="gramEnd"/>
-      <w:r>
-        <w:rPr>
-          <w:sz w:val="18"/>
-          <w:szCs w:val="18"/>
-        </w:rPr>
-        <w:t>Supplier)</w:t>
+        <w:t>(Supplier)</w:t>
       </w:r>
     </w:p>
     <w:p>
@@ -13482,7 +12296,6 @@
         </w:rPr>
       </w:pPr>
       <w:proofErr w:type="spellStart"/>
-      <w:proofErr w:type="gramStart"/>
       <w:r>
         <w:rPr>
           <w:sz w:val="18"/>
@@ -13496,15 +12309,7 @@
           <w:sz w:val="18"/>
           <w:szCs w:val="18"/>
         </w:rPr>
-        <w:t>(</w:t>
-      </w:r>
-      <w:proofErr w:type="gramEnd"/>
-      <w:r>
-        <w:rPr>
-          <w:sz w:val="18"/>
-          <w:szCs w:val="18"/>
-        </w:rPr>
-        <w:t>Product)</w:t>
+        <w:t>(Product)</w:t>
       </w:r>
     </w:p>
     <w:p>
@@ -13544,7 +12349,6 @@
         </w:rPr>
       </w:pPr>
       <w:proofErr w:type="spellStart"/>
-      <w:proofErr w:type="gramStart"/>
       <w:r>
         <w:rPr>
           <w:sz w:val="18"/>
@@ -13558,15 +12362,7 @@
           <w:sz w:val="18"/>
           <w:szCs w:val="18"/>
         </w:rPr>
-        <w:t>(</w:t>
-      </w:r>
-      <w:proofErr w:type="gramEnd"/>
-      <w:r>
-        <w:rPr>
-          <w:sz w:val="18"/>
-          <w:szCs w:val="18"/>
-        </w:rPr>
-        <w:t>Supplier)</w:t>
+        <w:t>(Supplier)</w:t>
       </w:r>
     </w:p>
     <w:p>
@@ -13582,7 +12378,6 @@
         </w:rPr>
       </w:pPr>
       <w:proofErr w:type="spellStart"/>
-      <w:proofErr w:type="gramStart"/>
       <w:r>
         <w:rPr>
           <w:sz w:val="18"/>
@@ -13599,7 +12394,6 @@
         <w:t>(</w:t>
       </w:r>
       <w:proofErr w:type="spellStart"/>
-      <w:proofErr w:type="gramEnd"/>
       <w:r>
         <w:rPr>
           <w:sz w:val="18"/>
@@ -13653,7 +12447,6 @@
         </w:rPr>
       </w:pPr>
       <w:proofErr w:type="spellStart"/>
-      <w:proofErr w:type="gramStart"/>
       <w:r>
         <w:rPr>
           <w:sz w:val="18"/>
@@ -13670,7 +12463,6 @@
         <w:t>(</w:t>
       </w:r>
       <w:proofErr w:type="spellStart"/>
-      <w:proofErr w:type="gramEnd"/>
       <w:r>
         <w:rPr>
           <w:sz w:val="18"/>
@@ -13700,7 +12492,6 @@
         </w:rPr>
       </w:pPr>
       <w:proofErr w:type="spellStart"/>
-      <w:proofErr w:type="gramStart"/>
       <w:r>
         <w:rPr>
           <w:sz w:val="18"/>
@@ -13714,15 +12505,7 @@
           <w:sz w:val="18"/>
           <w:szCs w:val="18"/>
         </w:rPr>
-        <w:t>(</w:t>
-      </w:r>
-      <w:proofErr w:type="gramEnd"/>
-      <w:r>
-        <w:rPr>
-          <w:sz w:val="18"/>
-          <w:szCs w:val="18"/>
-        </w:rPr>
-        <w:t>Product)</w:t>
+        <w:t>(Product)</w:t>
       </w:r>
     </w:p>
     <w:p>
@@ -14447,7 +13230,6 @@
         <w:t xml:space="preserve"> → </w:t>
       </w:r>
       <w:proofErr w:type="spellStart"/>
-      <w:proofErr w:type="gramStart"/>
       <w:r>
         <w:rPr>
           <w:sz w:val="18"/>
@@ -14464,7 +13246,6 @@
         <w:t>(</w:t>
       </w:r>
       <w:proofErr w:type="spellStart"/>
-      <w:proofErr w:type="gramEnd"/>
       <w:r>
         <w:rPr>
           <w:sz w:val="18"/>
@@ -14526,7 +13307,6 @@
         <w:t xml:space="preserve"> → </w:t>
       </w:r>
       <w:proofErr w:type="spellStart"/>
-      <w:proofErr w:type="gramStart"/>
       <w:r>
         <w:rPr>
           <w:sz w:val="18"/>
@@ -14540,15 +13320,7 @@
           <w:sz w:val="18"/>
           <w:szCs w:val="18"/>
         </w:rPr>
-        <w:t>(</w:t>
-      </w:r>
-      <w:proofErr w:type="gramEnd"/>
-      <w:r>
-        <w:rPr>
-          <w:sz w:val="18"/>
-          <w:szCs w:val="18"/>
-        </w:rPr>
-        <w:t>Sale).</w:t>
+        <w:t>(Sale).</w:t>
       </w:r>
     </w:p>
     <w:p>
@@ -14644,7 +13416,6 @@
         <w:t xml:space="preserve"> → </w:t>
       </w:r>
       <w:proofErr w:type="spellStart"/>
-      <w:proofErr w:type="gramStart"/>
       <w:r>
         <w:rPr>
           <w:sz w:val="18"/>
@@ -14658,15 +13429,7 @@
           <w:sz w:val="18"/>
           <w:szCs w:val="18"/>
         </w:rPr>
-        <w:t>(</w:t>
-      </w:r>
-      <w:proofErr w:type="gramEnd"/>
-      <w:r>
-        <w:rPr>
-          <w:sz w:val="18"/>
-          <w:szCs w:val="18"/>
-        </w:rPr>
-        <w:t xml:space="preserve">Product) and </w:t>
+        <w:t xml:space="preserve">(Product) and </w:t>
       </w:r>
       <w:proofErr w:type="spellStart"/>
       <w:r>
@@ -14716,7 +13479,6 @@
         <w:t xml:space="preserve"> → </w:t>
       </w:r>
       <w:proofErr w:type="spellStart"/>
-      <w:proofErr w:type="gramStart"/>
       <w:r>
         <w:rPr>
           <w:sz w:val="18"/>
@@ -14730,15 +13492,7 @@
           <w:sz w:val="18"/>
           <w:szCs w:val="18"/>
         </w:rPr>
-        <w:t>(</w:t>
-      </w:r>
-      <w:proofErr w:type="gramEnd"/>
-      <w:r>
-        <w:rPr>
-          <w:sz w:val="18"/>
-          <w:szCs w:val="18"/>
-        </w:rPr>
-        <w:t>User, '</w:t>
+        <w:t>(User, '</w:t>
       </w:r>
       <w:proofErr w:type="spellStart"/>
       <w:r>
@@ -14788,7 +13542,6 @@
         <w:t xml:space="preserve"> → </w:t>
       </w:r>
       <w:proofErr w:type="spellStart"/>
-      <w:proofErr w:type="gramStart"/>
       <w:r>
         <w:rPr>
           <w:sz w:val="18"/>
@@ -14802,15 +13555,7 @@
           <w:sz w:val="18"/>
           <w:szCs w:val="18"/>
         </w:rPr>
-        <w:t>(</w:t>
-      </w:r>
-      <w:proofErr w:type="gramEnd"/>
-      <w:r>
-        <w:rPr>
-          <w:sz w:val="18"/>
-          <w:szCs w:val="18"/>
-        </w:rPr>
-        <w:t>User).</w:t>
+        <w:t>(User).</w:t>
       </w:r>
     </w:p>
     <w:p>
@@ -14915,7 +13660,6 @@
         <w:t xml:space="preserve"> artisan </w:t>
       </w:r>
       <w:proofErr w:type="spellStart"/>
-      <w:proofErr w:type="gramStart"/>
       <w:r>
         <w:rPr>
           <w:sz w:val="18"/>
@@ -14924,7 +13668,6 @@
         <w:t>make:controller</w:t>
       </w:r>
       <w:proofErr w:type="spellEnd"/>
-      <w:proofErr w:type="gramEnd"/>
       <w:r>
         <w:rPr>
           <w:sz w:val="18"/>
@@ -17815,6 +16558,7 @@
   <w:style w:type="character" w:default="1" w:styleId="DefaultParagraphFont">
     <w:name w:val="Default Paragraph Font"/>
     <w:uiPriority w:val="1"/>
+    <w:semiHidden/>
     <w:unhideWhenUsed/>
   </w:style>
   <w:style w:type="table" w:default="1" w:styleId="TableNormal">

</xml_diff>